<commit_message>
Add Game System Plan
</commit_message>
<xml_diff>
--- a/기획/게임 시스템 기획.docx
+++ b/기획/게임 시스템 기획.docx
@@ -26,7 +26,7 @@
             <w:tblLook w:val="04A0" w:firstRow="1" w:lastRow="0" w:firstColumn="1" w:lastColumn="0" w:noHBand="0" w:noVBand="1"/>
           </w:tblPr>
           <w:tblGrid>
-            <w:gridCol w:w="7209"/>
+            <w:gridCol w:w="7785"/>
           </w:tblGrid>
           <w:tr>
             <w:sdt>
@@ -40,6 +40,7 @@
                 <w:placeholder>
                   <w:docPart w:val="100EE9185371489EA04AA4ACF6CC28E6"/>
                 </w:placeholder>
+                <w:showingPlcHdr/>
                 <w:dataBinding w:prefixMappings="xmlns:ns0='http://schemas.openxmlformats.org/officeDocument/2006/extended-properties'" w:xpath="/ns0:Properties[1]/ns0:Company[1]" w:storeItemID="{6668398D-A668-4E3E-A5EB-62B293D839F1}"/>
                 <w:text/>
               </w:sdtPr>
@@ -64,9 +65,9 @@
                     <w:r>
                       <w:rPr>
                         <w:color w:val="2F5496" w:themeColor="accent1" w:themeShade="BF"/>
-                        <w:szCs w:val="24"/>
+                        <w:lang w:val="ko-KR"/>
                       </w:rPr>
-                      <w:t xml:space="preserve"> </w:t>
+                      <w:t>[회사 이름]</w:t>
                     </w:r>
                   </w:p>
                 </w:tc>
@@ -173,7 +174,7 @@
             <w:tblLook w:val="04A0" w:firstRow="1" w:lastRow="0" w:firstColumn="1" w:lastColumn="0" w:noHBand="0" w:noVBand="1"/>
           </w:tblPr>
           <w:tblGrid>
-            <w:gridCol w:w="6963"/>
+            <w:gridCol w:w="7518"/>
           </w:tblGrid>
           <w:tr>
             <w:tc>
@@ -278,11 +279,6 @@
           </w:tr>
         </w:tbl>
         <w:p>
-          <w:pPr>
-            <w:rPr>
-              <w:rFonts w:hint="eastAsia"/>
-            </w:rPr>
-          </w:pPr>
           <w:r>
             <w:br w:type="page"/>
           </w:r>
@@ -292,6 +288,12 @@
     <w:sdt>
       <w:sdtPr>
         <w:rPr>
+          <w:rFonts w:asciiTheme="minorHAnsi" w:eastAsiaTheme="minorEastAsia" w:hAnsiTheme="minorHAnsi" w:cs="Times New Roman"/>
+          <w:b w:val="0"/>
+          <w:bCs w:val="0"/>
+          <w:kern w:val="0"/>
+          <w:sz w:val="24"/>
+          <w:szCs w:val="24"/>
           <w:lang w:val="ko-KR"/>
         </w:rPr>
         <w:id w:val="-1291738544"/>
@@ -300,14 +302,6 @@
           <w:docPartUnique/>
         </w:docPartObj>
       </w:sdtPr>
-      <w:sdtEndPr>
-        <w:rPr>
-          <w:rFonts w:asciiTheme="minorHAnsi" w:eastAsiaTheme="minorEastAsia" w:hAnsiTheme="minorHAnsi" w:cs="Times New Roman"/>
-          <w:kern w:val="0"/>
-          <w:sz w:val="24"/>
-          <w:szCs w:val="24"/>
-        </w:rPr>
-      </w:sdtEndPr>
       <w:sdtContent>
         <w:p>
           <w:pPr>
@@ -328,7 +322,7 @@
           <w:pPr>
             <w:pStyle w:val="10"/>
             <w:tabs>
-              <w:tab w:val="right" w:leader="dot" w:pos="9016"/>
+              <w:tab w:val="right" w:leader="dot" w:pos="9736"/>
             </w:tabs>
             <w:rPr>
               <w:rFonts w:cstheme="minorBidi"/>
@@ -347,7 +341,7 @@
           <w:r>
             <w:fldChar w:fldCharType="separate"/>
           </w:r>
-          <w:hyperlink w:anchor="_Toc237114740" w:history="1">
+          <w:hyperlink w:anchor="_Toc237206039" w:history="1">
             <w:r>
               <w:rPr>
                 <w:rStyle w:val="af1"/>
@@ -376,7 +370,7 @@
                 <w:noProof/>
                 <w:webHidden/>
               </w:rPr>
-              <w:instrText xml:space="preserve"> PAGEREF _Toc237114740 \h </w:instrText>
+              <w:instrText xml:space="preserve"> PAGEREF _Toc237206039 \h </w:instrText>
             </w:r>
             <w:r>
               <w:rPr>
@@ -411,7 +405,808 @@
           <w:pPr>
             <w:pStyle w:val="20"/>
             <w:tabs>
-              <w:tab w:val="right" w:leader="dot" w:pos="9016"/>
+              <w:tab w:val="right" w:leader="dot" w:pos="9736"/>
+            </w:tabs>
+            <w:rPr>
+              <w:rFonts w:cstheme="minorBidi"/>
+              <w:noProof/>
+              <w:kern w:val="2"/>
+              <w:sz w:val="18"/>
+              <w:szCs w:val="18"/>
+              <w14:ligatures w14:val="standardContextual"/>
+            </w:rPr>
+          </w:pPr>
+          <w:hyperlink w:anchor="_Toc237206040" w:history="1">
+            <w:r>
+              <w:rPr>
+                <w:rStyle w:val="af1"/>
+                <w:noProof/>
+                <w:sz w:val="18"/>
+                <w:szCs w:val="18"/>
+              </w:rPr>
+              <w:t>1-1 코어 메카닉스 핵심 요소</w:t>
+            </w:r>
+            <w:r>
+              <w:rPr>
+                <w:noProof/>
+                <w:webHidden/>
+                <w:sz w:val="18"/>
+                <w:szCs w:val="18"/>
+              </w:rPr>
+              <w:tab/>
+            </w:r>
+            <w:r>
+              <w:rPr>
+                <w:noProof/>
+                <w:webHidden/>
+                <w:sz w:val="18"/>
+                <w:szCs w:val="18"/>
+              </w:rPr>
+              <w:fldChar w:fldCharType="begin"/>
+            </w:r>
+            <w:r>
+              <w:rPr>
+                <w:noProof/>
+                <w:webHidden/>
+                <w:sz w:val="18"/>
+                <w:szCs w:val="18"/>
+              </w:rPr>
+              <w:instrText xml:space="preserve"> PAGEREF _Toc237206040 \h </w:instrText>
+            </w:r>
+            <w:r>
+              <w:rPr>
+                <w:noProof/>
+                <w:webHidden/>
+                <w:sz w:val="18"/>
+                <w:szCs w:val="18"/>
+              </w:rPr>
+            </w:r>
+            <w:r>
+              <w:rPr>
+                <w:noProof/>
+                <w:webHidden/>
+                <w:sz w:val="18"/>
+                <w:szCs w:val="18"/>
+              </w:rPr>
+              <w:fldChar w:fldCharType="separate"/>
+            </w:r>
+            <w:r>
+              <w:rPr>
+                <w:noProof/>
+                <w:webHidden/>
+                <w:sz w:val="18"/>
+                <w:szCs w:val="18"/>
+              </w:rPr>
+              <w:t>2</w:t>
+            </w:r>
+            <w:r>
+              <w:rPr>
+                <w:noProof/>
+                <w:webHidden/>
+                <w:sz w:val="18"/>
+                <w:szCs w:val="18"/>
+              </w:rPr>
+              <w:fldChar w:fldCharType="end"/>
+            </w:r>
+          </w:hyperlink>
+        </w:p>
+        <w:p>
+          <w:pPr>
+            <w:pStyle w:val="20"/>
+            <w:tabs>
+              <w:tab w:val="right" w:leader="dot" w:pos="9736"/>
+            </w:tabs>
+            <w:rPr>
+              <w:rFonts w:cstheme="minorBidi"/>
+              <w:noProof/>
+              <w:kern w:val="2"/>
+              <w:sz w:val="18"/>
+              <w:szCs w:val="18"/>
+              <w14:ligatures w14:val="standardContextual"/>
+            </w:rPr>
+          </w:pPr>
+          <w:hyperlink w:anchor="_Toc237206041" w:history="1">
+            <w:r>
+              <w:rPr>
+                <w:rStyle w:val="af1"/>
+                <w:noProof/>
+                <w:sz w:val="18"/>
+                <w:szCs w:val="18"/>
+              </w:rPr>
+              <w:t>1-1 플레이어가 가장 자주 하는 행동</w:t>
+            </w:r>
+            <w:r>
+              <w:rPr>
+                <w:noProof/>
+                <w:webHidden/>
+                <w:sz w:val="18"/>
+                <w:szCs w:val="18"/>
+              </w:rPr>
+              <w:tab/>
+            </w:r>
+            <w:r>
+              <w:rPr>
+                <w:noProof/>
+                <w:webHidden/>
+                <w:sz w:val="18"/>
+                <w:szCs w:val="18"/>
+              </w:rPr>
+              <w:fldChar w:fldCharType="begin"/>
+            </w:r>
+            <w:r>
+              <w:rPr>
+                <w:noProof/>
+                <w:webHidden/>
+                <w:sz w:val="18"/>
+                <w:szCs w:val="18"/>
+              </w:rPr>
+              <w:instrText xml:space="preserve"> PAGEREF _Toc237206041 \h </w:instrText>
+            </w:r>
+            <w:r>
+              <w:rPr>
+                <w:noProof/>
+                <w:webHidden/>
+                <w:sz w:val="18"/>
+                <w:szCs w:val="18"/>
+              </w:rPr>
+            </w:r>
+            <w:r>
+              <w:rPr>
+                <w:noProof/>
+                <w:webHidden/>
+                <w:sz w:val="18"/>
+                <w:szCs w:val="18"/>
+              </w:rPr>
+              <w:fldChar w:fldCharType="separate"/>
+            </w:r>
+            <w:r>
+              <w:rPr>
+                <w:noProof/>
+                <w:webHidden/>
+                <w:sz w:val="18"/>
+                <w:szCs w:val="18"/>
+              </w:rPr>
+              <w:t>2</w:t>
+            </w:r>
+            <w:r>
+              <w:rPr>
+                <w:noProof/>
+                <w:webHidden/>
+                <w:sz w:val="18"/>
+                <w:szCs w:val="18"/>
+              </w:rPr>
+              <w:fldChar w:fldCharType="end"/>
+            </w:r>
+          </w:hyperlink>
+        </w:p>
+        <w:p>
+          <w:pPr>
+            <w:pStyle w:val="20"/>
+            <w:tabs>
+              <w:tab w:val="right" w:leader="dot" w:pos="9736"/>
+            </w:tabs>
+            <w:rPr>
+              <w:rFonts w:cstheme="minorBidi"/>
+              <w:noProof/>
+              <w:kern w:val="2"/>
+              <w:sz w:val="18"/>
+              <w:szCs w:val="18"/>
+              <w14:ligatures w14:val="standardContextual"/>
+            </w:rPr>
+          </w:pPr>
+          <w:hyperlink w:anchor="_Toc237206042" w:history="1">
+            <w:r>
+              <w:rPr>
+                <w:rStyle w:val="af1"/>
+                <w:noProof/>
+                <w:sz w:val="18"/>
+                <w:szCs w:val="18"/>
+              </w:rPr>
+              <w:t>1-2 그 행동이 필요한 이유</w:t>
+            </w:r>
+            <w:r>
+              <w:rPr>
+                <w:noProof/>
+                <w:webHidden/>
+                <w:sz w:val="18"/>
+                <w:szCs w:val="18"/>
+              </w:rPr>
+              <w:tab/>
+            </w:r>
+            <w:r>
+              <w:rPr>
+                <w:noProof/>
+                <w:webHidden/>
+                <w:sz w:val="18"/>
+                <w:szCs w:val="18"/>
+              </w:rPr>
+              <w:fldChar w:fldCharType="begin"/>
+            </w:r>
+            <w:r>
+              <w:rPr>
+                <w:noProof/>
+                <w:webHidden/>
+                <w:sz w:val="18"/>
+                <w:szCs w:val="18"/>
+              </w:rPr>
+              <w:instrText xml:space="preserve"> PAGEREF _Toc237206042 \h </w:instrText>
+            </w:r>
+            <w:r>
+              <w:rPr>
+                <w:noProof/>
+                <w:webHidden/>
+                <w:sz w:val="18"/>
+                <w:szCs w:val="18"/>
+              </w:rPr>
+            </w:r>
+            <w:r>
+              <w:rPr>
+                <w:noProof/>
+                <w:webHidden/>
+                <w:sz w:val="18"/>
+                <w:szCs w:val="18"/>
+              </w:rPr>
+              <w:fldChar w:fldCharType="separate"/>
+            </w:r>
+            <w:r>
+              <w:rPr>
+                <w:noProof/>
+                <w:webHidden/>
+                <w:sz w:val="18"/>
+                <w:szCs w:val="18"/>
+              </w:rPr>
+              <w:t>2</w:t>
+            </w:r>
+            <w:r>
+              <w:rPr>
+                <w:noProof/>
+                <w:webHidden/>
+                <w:sz w:val="18"/>
+                <w:szCs w:val="18"/>
+              </w:rPr>
+              <w:fldChar w:fldCharType="end"/>
+            </w:r>
+          </w:hyperlink>
+        </w:p>
+        <w:p>
+          <w:pPr>
+            <w:pStyle w:val="20"/>
+            <w:tabs>
+              <w:tab w:val="right" w:leader="dot" w:pos="9736"/>
+            </w:tabs>
+            <w:rPr>
+              <w:rFonts w:cstheme="minorBidi"/>
+              <w:noProof/>
+              <w:kern w:val="2"/>
+              <w:sz w:val="18"/>
+              <w:szCs w:val="18"/>
+              <w14:ligatures w14:val="standardContextual"/>
+            </w:rPr>
+          </w:pPr>
+          <w:hyperlink w:anchor="_Toc237206043" w:history="1">
+            <w:r>
+              <w:rPr>
+                <w:rStyle w:val="af1"/>
+                <w:noProof/>
+                <w:sz w:val="18"/>
+                <w:szCs w:val="18"/>
+              </w:rPr>
+              <w:t>1-3 행동을 시작하는 입력</w:t>
+            </w:r>
+            <w:r>
+              <w:rPr>
+                <w:noProof/>
+                <w:webHidden/>
+                <w:sz w:val="18"/>
+                <w:szCs w:val="18"/>
+              </w:rPr>
+              <w:tab/>
+            </w:r>
+            <w:r>
+              <w:rPr>
+                <w:noProof/>
+                <w:webHidden/>
+                <w:sz w:val="18"/>
+                <w:szCs w:val="18"/>
+              </w:rPr>
+              <w:fldChar w:fldCharType="begin"/>
+            </w:r>
+            <w:r>
+              <w:rPr>
+                <w:noProof/>
+                <w:webHidden/>
+                <w:sz w:val="18"/>
+                <w:szCs w:val="18"/>
+              </w:rPr>
+              <w:instrText xml:space="preserve"> PAGEREF _Toc237206043 \h </w:instrText>
+            </w:r>
+            <w:r>
+              <w:rPr>
+                <w:noProof/>
+                <w:webHidden/>
+                <w:sz w:val="18"/>
+                <w:szCs w:val="18"/>
+              </w:rPr>
+            </w:r>
+            <w:r>
+              <w:rPr>
+                <w:noProof/>
+                <w:webHidden/>
+                <w:sz w:val="18"/>
+                <w:szCs w:val="18"/>
+              </w:rPr>
+              <w:fldChar w:fldCharType="separate"/>
+            </w:r>
+            <w:r>
+              <w:rPr>
+                <w:noProof/>
+                <w:webHidden/>
+                <w:sz w:val="18"/>
+                <w:szCs w:val="18"/>
+              </w:rPr>
+              <w:t>2</w:t>
+            </w:r>
+            <w:r>
+              <w:rPr>
+                <w:noProof/>
+                <w:webHidden/>
+                <w:sz w:val="18"/>
+                <w:szCs w:val="18"/>
+              </w:rPr>
+              <w:fldChar w:fldCharType="end"/>
+            </w:r>
+          </w:hyperlink>
+        </w:p>
+        <w:p>
+          <w:pPr>
+            <w:pStyle w:val="20"/>
+            <w:tabs>
+              <w:tab w:val="right" w:leader="dot" w:pos="9736"/>
+            </w:tabs>
+            <w:rPr>
+              <w:rFonts w:cstheme="minorBidi"/>
+              <w:noProof/>
+              <w:kern w:val="2"/>
+              <w:sz w:val="18"/>
+              <w:szCs w:val="18"/>
+              <w14:ligatures w14:val="standardContextual"/>
+            </w:rPr>
+          </w:pPr>
+          <w:hyperlink w:anchor="_Toc237206044" w:history="1">
+            <w:r>
+              <w:rPr>
+                <w:rStyle w:val="af1"/>
+                <w:noProof/>
+                <w:sz w:val="18"/>
+                <w:szCs w:val="18"/>
+              </w:rPr>
+              <w:t>1-4 행동 후 나타나는 출력</w:t>
+            </w:r>
+            <w:r>
+              <w:rPr>
+                <w:noProof/>
+                <w:webHidden/>
+                <w:sz w:val="18"/>
+                <w:szCs w:val="18"/>
+              </w:rPr>
+              <w:tab/>
+            </w:r>
+            <w:r>
+              <w:rPr>
+                <w:noProof/>
+                <w:webHidden/>
+                <w:sz w:val="18"/>
+                <w:szCs w:val="18"/>
+              </w:rPr>
+              <w:fldChar w:fldCharType="begin"/>
+            </w:r>
+            <w:r>
+              <w:rPr>
+                <w:noProof/>
+                <w:webHidden/>
+                <w:sz w:val="18"/>
+                <w:szCs w:val="18"/>
+              </w:rPr>
+              <w:instrText xml:space="preserve"> PAGEREF _Toc237206044 \h </w:instrText>
+            </w:r>
+            <w:r>
+              <w:rPr>
+                <w:noProof/>
+                <w:webHidden/>
+                <w:sz w:val="18"/>
+                <w:szCs w:val="18"/>
+              </w:rPr>
+            </w:r>
+            <w:r>
+              <w:rPr>
+                <w:noProof/>
+                <w:webHidden/>
+                <w:sz w:val="18"/>
+                <w:szCs w:val="18"/>
+              </w:rPr>
+              <w:fldChar w:fldCharType="separate"/>
+            </w:r>
+            <w:r>
+              <w:rPr>
+                <w:noProof/>
+                <w:webHidden/>
+                <w:sz w:val="18"/>
+                <w:szCs w:val="18"/>
+              </w:rPr>
+              <w:t>2</w:t>
+            </w:r>
+            <w:r>
+              <w:rPr>
+                <w:noProof/>
+                <w:webHidden/>
+                <w:sz w:val="18"/>
+                <w:szCs w:val="18"/>
+              </w:rPr>
+              <w:fldChar w:fldCharType="end"/>
+            </w:r>
+          </w:hyperlink>
+        </w:p>
+        <w:p>
+          <w:pPr>
+            <w:pStyle w:val="20"/>
+            <w:tabs>
+              <w:tab w:val="right" w:leader="dot" w:pos="9736"/>
+            </w:tabs>
+            <w:rPr>
+              <w:rFonts w:cstheme="minorBidi"/>
+              <w:noProof/>
+              <w:kern w:val="2"/>
+              <w:sz w:val="18"/>
+              <w:szCs w:val="18"/>
+              <w14:ligatures w14:val="standardContextual"/>
+            </w:rPr>
+          </w:pPr>
+          <w:hyperlink w:anchor="_Toc237206045" w:history="1">
+            <w:r>
+              <w:rPr>
+                <w:rStyle w:val="af1"/>
+                <w:noProof/>
+                <w:sz w:val="18"/>
+                <w:szCs w:val="18"/>
+              </w:rPr>
+              <w:t>1-5 성공 조건</w:t>
+            </w:r>
+            <w:r>
+              <w:rPr>
+                <w:noProof/>
+                <w:webHidden/>
+                <w:sz w:val="18"/>
+                <w:szCs w:val="18"/>
+              </w:rPr>
+              <w:tab/>
+            </w:r>
+            <w:r>
+              <w:rPr>
+                <w:noProof/>
+                <w:webHidden/>
+                <w:sz w:val="18"/>
+                <w:szCs w:val="18"/>
+              </w:rPr>
+              <w:fldChar w:fldCharType="begin"/>
+            </w:r>
+            <w:r>
+              <w:rPr>
+                <w:noProof/>
+                <w:webHidden/>
+                <w:sz w:val="18"/>
+                <w:szCs w:val="18"/>
+              </w:rPr>
+              <w:instrText xml:space="preserve"> PAGEREF _Toc237206045 \h </w:instrText>
+            </w:r>
+            <w:r>
+              <w:rPr>
+                <w:noProof/>
+                <w:webHidden/>
+                <w:sz w:val="18"/>
+                <w:szCs w:val="18"/>
+              </w:rPr>
+            </w:r>
+            <w:r>
+              <w:rPr>
+                <w:noProof/>
+                <w:webHidden/>
+                <w:sz w:val="18"/>
+                <w:szCs w:val="18"/>
+              </w:rPr>
+              <w:fldChar w:fldCharType="separate"/>
+            </w:r>
+            <w:r>
+              <w:rPr>
+                <w:noProof/>
+                <w:webHidden/>
+                <w:sz w:val="18"/>
+                <w:szCs w:val="18"/>
+              </w:rPr>
+              <w:t>2</w:t>
+            </w:r>
+            <w:r>
+              <w:rPr>
+                <w:noProof/>
+                <w:webHidden/>
+                <w:sz w:val="18"/>
+                <w:szCs w:val="18"/>
+              </w:rPr>
+              <w:fldChar w:fldCharType="end"/>
+            </w:r>
+          </w:hyperlink>
+        </w:p>
+        <w:p>
+          <w:pPr>
+            <w:pStyle w:val="20"/>
+            <w:tabs>
+              <w:tab w:val="right" w:leader="dot" w:pos="9736"/>
+            </w:tabs>
+            <w:rPr>
+              <w:rFonts w:cstheme="minorBidi"/>
+              <w:noProof/>
+              <w:kern w:val="2"/>
+              <w:sz w:val="18"/>
+              <w:szCs w:val="18"/>
+              <w14:ligatures w14:val="standardContextual"/>
+            </w:rPr>
+          </w:pPr>
+          <w:hyperlink w:anchor="_Toc237206046" w:history="1">
+            <w:r>
+              <w:rPr>
+                <w:rStyle w:val="af1"/>
+                <w:noProof/>
+                <w:sz w:val="18"/>
+                <w:szCs w:val="18"/>
+              </w:rPr>
+              <w:t>1-6 실패 조건</w:t>
+            </w:r>
+            <w:r>
+              <w:rPr>
+                <w:noProof/>
+                <w:webHidden/>
+                <w:sz w:val="18"/>
+                <w:szCs w:val="18"/>
+              </w:rPr>
+              <w:tab/>
+            </w:r>
+            <w:r>
+              <w:rPr>
+                <w:noProof/>
+                <w:webHidden/>
+                <w:sz w:val="18"/>
+                <w:szCs w:val="18"/>
+              </w:rPr>
+              <w:fldChar w:fldCharType="begin"/>
+            </w:r>
+            <w:r>
+              <w:rPr>
+                <w:noProof/>
+                <w:webHidden/>
+                <w:sz w:val="18"/>
+                <w:szCs w:val="18"/>
+              </w:rPr>
+              <w:instrText xml:space="preserve"> PAGEREF _Toc237206046 \h </w:instrText>
+            </w:r>
+            <w:r>
+              <w:rPr>
+                <w:noProof/>
+                <w:webHidden/>
+                <w:sz w:val="18"/>
+                <w:szCs w:val="18"/>
+              </w:rPr>
+            </w:r>
+            <w:r>
+              <w:rPr>
+                <w:noProof/>
+                <w:webHidden/>
+                <w:sz w:val="18"/>
+                <w:szCs w:val="18"/>
+              </w:rPr>
+              <w:fldChar w:fldCharType="separate"/>
+            </w:r>
+            <w:r>
+              <w:rPr>
+                <w:noProof/>
+                <w:webHidden/>
+                <w:sz w:val="18"/>
+                <w:szCs w:val="18"/>
+              </w:rPr>
+              <w:t>2</w:t>
+            </w:r>
+            <w:r>
+              <w:rPr>
+                <w:noProof/>
+                <w:webHidden/>
+                <w:sz w:val="18"/>
+                <w:szCs w:val="18"/>
+              </w:rPr>
+              <w:fldChar w:fldCharType="end"/>
+            </w:r>
+          </w:hyperlink>
+        </w:p>
+        <w:p>
+          <w:pPr>
+            <w:pStyle w:val="20"/>
+            <w:tabs>
+              <w:tab w:val="right" w:leader="dot" w:pos="9736"/>
+            </w:tabs>
+            <w:rPr>
+              <w:rFonts w:cstheme="minorBidi"/>
+              <w:noProof/>
+              <w:kern w:val="2"/>
+              <w:sz w:val="18"/>
+              <w:szCs w:val="18"/>
+              <w14:ligatures w14:val="standardContextual"/>
+            </w:rPr>
+          </w:pPr>
+          <w:hyperlink w:anchor="_Toc237206047" w:history="1">
+            <w:r>
+              <w:rPr>
+                <w:rStyle w:val="af1"/>
+                <w:noProof/>
+                <w:sz w:val="18"/>
+                <w:szCs w:val="18"/>
+              </w:rPr>
+              <w:t>1-7 이 행동이 재미로 이어지는 이유</w:t>
+            </w:r>
+            <w:r>
+              <w:rPr>
+                <w:noProof/>
+                <w:webHidden/>
+                <w:sz w:val="18"/>
+                <w:szCs w:val="18"/>
+              </w:rPr>
+              <w:tab/>
+            </w:r>
+            <w:r>
+              <w:rPr>
+                <w:noProof/>
+                <w:webHidden/>
+                <w:sz w:val="18"/>
+                <w:szCs w:val="18"/>
+              </w:rPr>
+              <w:fldChar w:fldCharType="begin"/>
+            </w:r>
+            <w:r>
+              <w:rPr>
+                <w:noProof/>
+                <w:webHidden/>
+                <w:sz w:val="18"/>
+                <w:szCs w:val="18"/>
+              </w:rPr>
+              <w:instrText xml:space="preserve"> PAGEREF _Toc237206047 \h </w:instrText>
+            </w:r>
+            <w:r>
+              <w:rPr>
+                <w:noProof/>
+                <w:webHidden/>
+                <w:sz w:val="18"/>
+                <w:szCs w:val="18"/>
+              </w:rPr>
+            </w:r>
+            <w:r>
+              <w:rPr>
+                <w:noProof/>
+                <w:webHidden/>
+                <w:sz w:val="18"/>
+                <w:szCs w:val="18"/>
+              </w:rPr>
+              <w:fldChar w:fldCharType="separate"/>
+            </w:r>
+            <w:r>
+              <w:rPr>
+                <w:noProof/>
+                <w:webHidden/>
+                <w:sz w:val="18"/>
+                <w:szCs w:val="18"/>
+              </w:rPr>
+              <w:t>3</w:t>
+            </w:r>
+            <w:r>
+              <w:rPr>
+                <w:noProof/>
+                <w:webHidden/>
+                <w:sz w:val="18"/>
+                <w:szCs w:val="18"/>
+              </w:rPr>
+              <w:fldChar w:fldCharType="end"/>
+            </w:r>
+          </w:hyperlink>
+        </w:p>
+        <w:p>
+          <w:pPr>
+            <w:pStyle w:val="20"/>
+            <w:tabs>
+              <w:tab w:val="right" w:leader="dot" w:pos="9736"/>
+            </w:tabs>
+            <w:rPr>
+              <w:rFonts w:cstheme="minorBidi"/>
+              <w:noProof/>
+              <w:kern w:val="2"/>
+              <w:sz w:val="18"/>
+              <w:szCs w:val="18"/>
+              <w14:ligatures w14:val="standardContextual"/>
+            </w:rPr>
+          </w:pPr>
+          <w:hyperlink w:anchor="_Toc237206048" w:history="1">
+            <w:r>
+              <w:rPr>
+                <w:rStyle w:val="af1"/>
+                <w:noProof/>
+                <w:sz w:val="18"/>
+                <w:szCs w:val="18"/>
+              </w:rPr>
+              <w:t>1-8 없어도 되는 기능</w:t>
+            </w:r>
+            <w:r>
+              <w:rPr>
+                <w:noProof/>
+                <w:webHidden/>
+                <w:sz w:val="18"/>
+                <w:szCs w:val="18"/>
+              </w:rPr>
+              <w:tab/>
+            </w:r>
+            <w:r>
+              <w:rPr>
+                <w:noProof/>
+                <w:webHidden/>
+                <w:sz w:val="18"/>
+                <w:szCs w:val="18"/>
+              </w:rPr>
+              <w:fldChar w:fldCharType="begin"/>
+            </w:r>
+            <w:r>
+              <w:rPr>
+                <w:noProof/>
+                <w:webHidden/>
+                <w:sz w:val="18"/>
+                <w:szCs w:val="18"/>
+              </w:rPr>
+              <w:instrText xml:space="preserve"> PAGEREF _Toc237206048 \h </w:instrText>
+            </w:r>
+            <w:r>
+              <w:rPr>
+                <w:noProof/>
+                <w:webHidden/>
+                <w:sz w:val="18"/>
+                <w:szCs w:val="18"/>
+              </w:rPr>
+            </w:r>
+            <w:r>
+              <w:rPr>
+                <w:noProof/>
+                <w:webHidden/>
+                <w:sz w:val="18"/>
+                <w:szCs w:val="18"/>
+              </w:rPr>
+              <w:fldChar w:fldCharType="separate"/>
+            </w:r>
+            <w:r>
+              <w:rPr>
+                <w:noProof/>
+                <w:webHidden/>
+                <w:sz w:val="18"/>
+                <w:szCs w:val="18"/>
+              </w:rPr>
+              <w:t>3</w:t>
+            </w:r>
+            <w:r>
+              <w:rPr>
+                <w:noProof/>
+                <w:webHidden/>
+                <w:sz w:val="18"/>
+                <w:szCs w:val="18"/>
+              </w:rPr>
+              <w:fldChar w:fldCharType="end"/>
+            </w:r>
+          </w:hyperlink>
+        </w:p>
+        <w:p>
+          <w:pPr>
+            <w:pStyle w:val="10"/>
+            <w:tabs>
+              <w:tab w:val="right" w:leader="dot" w:pos="9736"/>
             </w:tabs>
             <w:rPr>
               <w:rFonts w:cstheme="minorBidi"/>
@@ -421,13 +1216,15 @@
               <w14:ligatures w14:val="standardContextual"/>
             </w:rPr>
           </w:pPr>
-          <w:hyperlink w:anchor="_Toc237114741" w:history="1">
+          <w:hyperlink w:anchor="_Toc237206049" w:history="1">
             <w:r>
               <w:rPr>
                 <w:rStyle w:val="af1"/>
-                <w:noProof/>
-              </w:rPr>
-              <w:t>1-1 코어 메카닉스 핵심 요소</w:t>
+                <w:b/>
+                <w:bCs/>
+                <w:noProof/>
+              </w:rPr>
+              <w:t>2. 기본 흐름과 조건 분기</w:t>
             </w:r>
             <w:r>
               <w:rPr>
@@ -448,7 +1245,7 @@
                 <w:noProof/>
                 <w:webHidden/>
               </w:rPr>
-              <w:instrText xml:space="preserve"> PAGEREF _Toc237114741 \h </w:instrText>
+              <w:instrText xml:space="preserve"> PAGEREF _Toc237206049 \h </w:instrText>
             </w:r>
             <w:r>
               <w:rPr>
@@ -468,7 +1265,7 @@
                 <w:noProof/>
                 <w:webHidden/>
               </w:rPr>
-              <w:t>2</w:t>
+              <w:t>3</w:t>
             </w:r>
             <w:r>
               <w:rPr>
@@ -483,7 +1280,7 @@
           <w:pPr>
             <w:pStyle w:val="20"/>
             <w:tabs>
-              <w:tab w:val="right" w:leader="dot" w:pos="9016"/>
+              <w:tab w:val="right" w:leader="dot" w:pos="9736"/>
             </w:tabs>
             <w:rPr>
               <w:rFonts w:cstheme="minorBidi"/>
@@ -493,13 +1290,13 @@
               <w14:ligatures w14:val="standardContextual"/>
             </w:rPr>
           </w:pPr>
-          <w:hyperlink w:anchor="_Toc237114742" w:history="1">
+          <w:hyperlink w:anchor="_Toc237206050" w:history="1">
             <w:r>
               <w:rPr>
                 <w:rStyle w:val="af1"/>
                 <w:noProof/>
               </w:rPr>
-              <w:t>1-1 플레이어가 가장 자주 하는 행동</w:t>
+              <w:t>2-1 핵심 시스템 흐름도</w:t>
             </w:r>
             <w:r>
               <w:rPr>
@@ -520,511 +1317,7 @@
                 <w:noProof/>
                 <w:webHidden/>
               </w:rPr>
-              <w:instrText xml:space="preserve"> PAGEREF _Toc237114742 \h </w:instrText>
-            </w:r>
-            <w:r>
-              <w:rPr>
-                <w:noProof/>
-                <w:webHidden/>
-              </w:rPr>
-            </w:r>
-            <w:r>
-              <w:rPr>
-                <w:noProof/>
-                <w:webHidden/>
-              </w:rPr>
-              <w:fldChar w:fldCharType="separate"/>
-            </w:r>
-            <w:r>
-              <w:rPr>
-                <w:noProof/>
-                <w:webHidden/>
-              </w:rPr>
-              <w:t>2</w:t>
-            </w:r>
-            <w:r>
-              <w:rPr>
-                <w:noProof/>
-                <w:webHidden/>
-              </w:rPr>
-              <w:fldChar w:fldCharType="end"/>
-            </w:r>
-          </w:hyperlink>
-        </w:p>
-        <w:p>
-          <w:pPr>
-            <w:pStyle w:val="20"/>
-            <w:tabs>
-              <w:tab w:val="right" w:leader="dot" w:pos="9016"/>
-            </w:tabs>
-            <w:rPr>
-              <w:rFonts w:cstheme="minorBidi"/>
-              <w:noProof/>
-              <w:kern w:val="2"/>
-              <w:szCs w:val="24"/>
-              <w14:ligatures w14:val="standardContextual"/>
-            </w:rPr>
-          </w:pPr>
-          <w:hyperlink w:anchor="_Toc237114743" w:history="1">
-            <w:r>
-              <w:rPr>
-                <w:rStyle w:val="af1"/>
-                <w:noProof/>
-              </w:rPr>
-              <w:t>1-2 그 행동이 필요한 이유</w:t>
-            </w:r>
-            <w:r>
-              <w:rPr>
-                <w:noProof/>
-                <w:webHidden/>
-              </w:rPr>
-              <w:tab/>
-            </w:r>
-            <w:r>
-              <w:rPr>
-                <w:noProof/>
-                <w:webHidden/>
-              </w:rPr>
-              <w:fldChar w:fldCharType="begin"/>
-            </w:r>
-            <w:r>
-              <w:rPr>
-                <w:noProof/>
-                <w:webHidden/>
-              </w:rPr>
-              <w:instrText xml:space="preserve"> PAGEREF _Toc237114743 \h </w:instrText>
-            </w:r>
-            <w:r>
-              <w:rPr>
-                <w:noProof/>
-                <w:webHidden/>
-              </w:rPr>
-            </w:r>
-            <w:r>
-              <w:rPr>
-                <w:noProof/>
-                <w:webHidden/>
-              </w:rPr>
-              <w:fldChar w:fldCharType="separate"/>
-            </w:r>
-            <w:r>
-              <w:rPr>
-                <w:noProof/>
-                <w:webHidden/>
-              </w:rPr>
-              <w:t>2</w:t>
-            </w:r>
-            <w:r>
-              <w:rPr>
-                <w:noProof/>
-                <w:webHidden/>
-              </w:rPr>
-              <w:fldChar w:fldCharType="end"/>
-            </w:r>
-          </w:hyperlink>
-        </w:p>
-        <w:p>
-          <w:pPr>
-            <w:pStyle w:val="20"/>
-            <w:tabs>
-              <w:tab w:val="right" w:leader="dot" w:pos="9016"/>
-            </w:tabs>
-            <w:rPr>
-              <w:rFonts w:cstheme="minorBidi"/>
-              <w:noProof/>
-              <w:kern w:val="2"/>
-              <w:szCs w:val="24"/>
-              <w14:ligatures w14:val="standardContextual"/>
-            </w:rPr>
-          </w:pPr>
-          <w:hyperlink w:anchor="_Toc237114744" w:history="1">
-            <w:r>
-              <w:rPr>
-                <w:rStyle w:val="af1"/>
-                <w:noProof/>
-              </w:rPr>
-              <w:t>1-3 행동을 시작하는 입력</w:t>
-            </w:r>
-            <w:r>
-              <w:rPr>
-                <w:noProof/>
-                <w:webHidden/>
-              </w:rPr>
-              <w:tab/>
-            </w:r>
-            <w:r>
-              <w:rPr>
-                <w:noProof/>
-                <w:webHidden/>
-              </w:rPr>
-              <w:fldChar w:fldCharType="begin"/>
-            </w:r>
-            <w:r>
-              <w:rPr>
-                <w:noProof/>
-                <w:webHidden/>
-              </w:rPr>
-              <w:instrText xml:space="preserve"> PAGEREF _Toc237114744 \h </w:instrText>
-            </w:r>
-            <w:r>
-              <w:rPr>
-                <w:noProof/>
-                <w:webHidden/>
-              </w:rPr>
-            </w:r>
-            <w:r>
-              <w:rPr>
-                <w:noProof/>
-                <w:webHidden/>
-              </w:rPr>
-              <w:fldChar w:fldCharType="separate"/>
-            </w:r>
-            <w:r>
-              <w:rPr>
-                <w:noProof/>
-                <w:webHidden/>
-              </w:rPr>
-              <w:t>2</w:t>
-            </w:r>
-            <w:r>
-              <w:rPr>
-                <w:noProof/>
-                <w:webHidden/>
-              </w:rPr>
-              <w:fldChar w:fldCharType="end"/>
-            </w:r>
-          </w:hyperlink>
-        </w:p>
-        <w:p>
-          <w:pPr>
-            <w:pStyle w:val="20"/>
-            <w:tabs>
-              <w:tab w:val="right" w:leader="dot" w:pos="9016"/>
-            </w:tabs>
-            <w:rPr>
-              <w:rFonts w:cstheme="minorBidi"/>
-              <w:noProof/>
-              <w:kern w:val="2"/>
-              <w:szCs w:val="24"/>
-              <w14:ligatures w14:val="standardContextual"/>
-            </w:rPr>
-          </w:pPr>
-          <w:hyperlink w:anchor="_Toc237114745" w:history="1">
-            <w:r>
-              <w:rPr>
-                <w:rStyle w:val="af1"/>
-                <w:noProof/>
-              </w:rPr>
-              <w:t>1-4 행동 후 나타나는 출력</w:t>
-            </w:r>
-            <w:r>
-              <w:rPr>
-                <w:noProof/>
-                <w:webHidden/>
-              </w:rPr>
-              <w:tab/>
-            </w:r>
-            <w:r>
-              <w:rPr>
-                <w:noProof/>
-                <w:webHidden/>
-              </w:rPr>
-              <w:fldChar w:fldCharType="begin"/>
-            </w:r>
-            <w:r>
-              <w:rPr>
-                <w:noProof/>
-                <w:webHidden/>
-              </w:rPr>
-              <w:instrText xml:space="preserve"> PAGEREF _Toc237114745 \h </w:instrText>
-            </w:r>
-            <w:r>
-              <w:rPr>
-                <w:noProof/>
-                <w:webHidden/>
-              </w:rPr>
-            </w:r>
-            <w:r>
-              <w:rPr>
-                <w:noProof/>
-                <w:webHidden/>
-              </w:rPr>
-              <w:fldChar w:fldCharType="separate"/>
-            </w:r>
-            <w:r>
-              <w:rPr>
-                <w:noProof/>
-                <w:webHidden/>
-              </w:rPr>
-              <w:t>2</w:t>
-            </w:r>
-            <w:r>
-              <w:rPr>
-                <w:noProof/>
-                <w:webHidden/>
-              </w:rPr>
-              <w:fldChar w:fldCharType="end"/>
-            </w:r>
-          </w:hyperlink>
-        </w:p>
-        <w:p>
-          <w:pPr>
-            <w:pStyle w:val="20"/>
-            <w:tabs>
-              <w:tab w:val="right" w:leader="dot" w:pos="9016"/>
-            </w:tabs>
-            <w:rPr>
-              <w:rFonts w:cstheme="minorBidi"/>
-              <w:noProof/>
-              <w:kern w:val="2"/>
-              <w:szCs w:val="24"/>
-              <w14:ligatures w14:val="standardContextual"/>
-            </w:rPr>
-          </w:pPr>
-          <w:hyperlink w:anchor="_Toc237114746" w:history="1">
-            <w:r>
-              <w:rPr>
-                <w:rStyle w:val="af1"/>
-                <w:noProof/>
-              </w:rPr>
-              <w:t>1-5 성공 조건</w:t>
-            </w:r>
-            <w:r>
-              <w:rPr>
-                <w:noProof/>
-                <w:webHidden/>
-              </w:rPr>
-              <w:tab/>
-            </w:r>
-            <w:r>
-              <w:rPr>
-                <w:noProof/>
-                <w:webHidden/>
-              </w:rPr>
-              <w:fldChar w:fldCharType="begin"/>
-            </w:r>
-            <w:r>
-              <w:rPr>
-                <w:noProof/>
-                <w:webHidden/>
-              </w:rPr>
-              <w:instrText xml:space="preserve"> PAGEREF _Toc237114746 \h </w:instrText>
-            </w:r>
-            <w:r>
-              <w:rPr>
-                <w:noProof/>
-                <w:webHidden/>
-              </w:rPr>
-            </w:r>
-            <w:r>
-              <w:rPr>
-                <w:noProof/>
-                <w:webHidden/>
-              </w:rPr>
-              <w:fldChar w:fldCharType="separate"/>
-            </w:r>
-            <w:r>
-              <w:rPr>
-                <w:noProof/>
-                <w:webHidden/>
-              </w:rPr>
-              <w:t>2</w:t>
-            </w:r>
-            <w:r>
-              <w:rPr>
-                <w:noProof/>
-                <w:webHidden/>
-              </w:rPr>
-              <w:fldChar w:fldCharType="end"/>
-            </w:r>
-          </w:hyperlink>
-        </w:p>
-        <w:p>
-          <w:pPr>
-            <w:pStyle w:val="20"/>
-            <w:tabs>
-              <w:tab w:val="right" w:leader="dot" w:pos="9016"/>
-            </w:tabs>
-            <w:rPr>
-              <w:rFonts w:cstheme="minorBidi"/>
-              <w:noProof/>
-              <w:kern w:val="2"/>
-              <w:szCs w:val="24"/>
-              <w14:ligatures w14:val="standardContextual"/>
-            </w:rPr>
-          </w:pPr>
-          <w:hyperlink w:anchor="_Toc237114747" w:history="1">
-            <w:r>
-              <w:rPr>
-                <w:rStyle w:val="af1"/>
-                <w:noProof/>
-              </w:rPr>
-              <w:t>1-6 실패 조건</w:t>
-            </w:r>
-            <w:r>
-              <w:rPr>
-                <w:noProof/>
-                <w:webHidden/>
-              </w:rPr>
-              <w:tab/>
-            </w:r>
-            <w:r>
-              <w:rPr>
-                <w:noProof/>
-                <w:webHidden/>
-              </w:rPr>
-              <w:fldChar w:fldCharType="begin"/>
-            </w:r>
-            <w:r>
-              <w:rPr>
-                <w:noProof/>
-                <w:webHidden/>
-              </w:rPr>
-              <w:instrText xml:space="preserve"> PAGEREF _Toc237114747 \h </w:instrText>
-            </w:r>
-            <w:r>
-              <w:rPr>
-                <w:noProof/>
-                <w:webHidden/>
-              </w:rPr>
-            </w:r>
-            <w:r>
-              <w:rPr>
-                <w:noProof/>
-                <w:webHidden/>
-              </w:rPr>
-              <w:fldChar w:fldCharType="separate"/>
-            </w:r>
-            <w:r>
-              <w:rPr>
-                <w:noProof/>
-                <w:webHidden/>
-              </w:rPr>
-              <w:t>2</w:t>
-            </w:r>
-            <w:r>
-              <w:rPr>
-                <w:noProof/>
-                <w:webHidden/>
-              </w:rPr>
-              <w:fldChar w:fldCharType="end"/>
-            </w:r>
-          </w:hyperlink>
-        </w:p>
-        <w:p>
-          <w:pPr>
-            <w:pStyle w:val="20"/>
-            <w:tabs>
-              <w:tab w:val="right" w:leader="dot" w:pos="9016"/>
-            </w:tabs>
-            <w:rPr>
-              <w:rFonts w:cstheme="minorBidi"/>
-              <w:noProof/>
-              <w:kern w:val="2"/>
-              <w:szCs w:val="24"/>
-              <w14:ligatures w14:val="standardContextual"/>
-            </w:rPr>
-          </w:pPr>
-          <w:hyperlink w:anchor="_Toc237114748" w:history="1">
-            <w:r>
-              <w:rPr>
-                <w:rStyle w:val="af1"/>
-                <w:noProof/>
-              </w:rPr>
-              <w:t>1-7 이 행동이 재미로 이어지는 이유</w:t>
-            </w:r>
-            <w:r>
-              <w:rPr>
-                <w:noProof/>
-                <w:webHidden/>
-              </w:rPr>
-              <w:tab/>
-            </w:r>
-            <w:r>
-              <w:rPr>
-                <w:noProof/>
-                <w:webHidden/>
-              </w:rPr>
-              <w:fldChar w:fldCharType="begin"/>
-            </w:r>
-            <w:r>
-              <w:rPr>
-                <w:noProof/>
-                <w:webHidden/>
-              </w:rPr>
-              <w:instrText xml:space="preserve"> PAGEREF _Toc237114748 \h </w:instrText>
-            </w:r>
-            <w:r>
-              <w:rPr>
-                <w:noProof/>
-                <w:webHidden/>
-              </w:rPr>
-            </w:r>
-            <w:r>
-              <w:rPr>
-                <w:noProof/>
-                <w:webHidden/>
-              </w:rPr>
-              <w:fldChar w:fldCharType="separate"/>
-            </w:r>
-            <w:r>
-              <w:rPr>
-                <w:noProof/>
-                <w:webHidden/>
-              </w:rPr>
-              <w:t>3</w:t>
-            </w:r>
-            <w:r>
-              <w:rPr>
-                <w:noProof/>
-                <w:webHidden/>
-              </w:rPr>
-              <w:fldChar w:fldCharType="end"/>
-            </w:r>
-          </w:hyperlink>
-        </w:p>
-        <w:p>
-          <w:pPr>
-            <w:pStyle w:val="20"/>
-            <w:tabs>
-              <w:tab w:val="right" w:leader="dot" w:pos="9016"/>
-            </w:tabs>
-            <w:rPr>
-              <w:rFonts w:cstheme="minorBidi"/>
-              <w:noProof/>
-              <w:kern w:val="2"/>
-              <w:szCs w:val="24"/>
-              <w14:ligatures w14:val="standardContextual"/>
-            </w:rPr>
-          </w:pPr>
-          <w:hyperlink w:anchor="_Toc237114749" w:history="1">
-            <w:r>
-              <w:rPr>
-                <w:rStyle w:val="af1"/>
-                <w:noProof/>
-              </w:rPr>
-              <w:t>1-8 없어도 되는 기능</w:t>
-            </w:r>
-            <w:r>
-              <w:rPr>
-                <w:noProof/>
-                <w:webHidden/>
-              </w:rPr>
-              <w:tab/>
-            </w:r>
-            <w:r>
-              <w:rPr>
-                <w:noProof/>
-                <w:webHidden/>
-              </w:rPr>
-              <w:fldChar w:fldCharType="begin"/>
-            </w:r>
-            <w:r>
-              <w:rPr>
-                <w:noProof/>
-                <w:webHidden/>
-              </w:rPr>
-              <w:instrText xml:space="preserve"> PAGEREF _Toc237114749 \h </w:instrText>
+              <w:instrText xml:space="preserve"> PAGEREF _Toc237206050 \h </w:instrText>
             </w:r>
             <w:r>
               <w:rPr>
@@ -1077,7 +1370,6 @@
       <w:pPr>
         <w:outlineLvl w:val="0"/>
         <w:rPr>
-          <w:rFonts w:hint="eastAsia"/>
           <w:b/>
           <w:bCs/>
           <w:color w:val="4472C4" w:themeColor="accent1"/>
@@ -1085,7 +1377,7 @@
           <w:szCs w:val="28"/>
         </w:rPr>
       </w:pPr>
-      <w:bookmarkStart w:id="0" w:name="_Toc237114740"/>
+      <w:bookmarkStart w:id="0" w:name="_Toc237206039"/>
       <w:r>
         <w:rPr>
           <w:rFonts w:hint="eastAsia"/>
@@ -1096,7 +1388,31 @@
           <w:szCs w:val="28"/>
         </w:rPr>
         <w:lastRenderedPageBreak/>
-        <w:t>1. 코어 메카닉스 분석표</w:t>
+        <w:t xml:space="preserve">1. 코어 </w:t>
+      </w:r>
+      <w:proofErr w:type="spellStart"/>
+      <w:r>
+        <w:rPr>
+          <w:rFonts w:hint="eastAsia"/>
+          <w:b/>
+          <w:bCs/>
+          <w:color w:val="4472C4" w:themeColor="accent1"/>
+          <w:sz w:val="28"/>
+          <w:szCs w:val="28"/>
+        </w:rPr>
+        <w:t>메카닉스</w:t>
+      </w:r>
+      <w:proofErr w:type="spellEnd"/>
+      <w:r>
+        <w:rPr>
+          <w:rFonts w:hint="eastAsia"/>
+          <w:b/>
+          <w:bCs/>
+          <w:color w:val="4472C4" w:themeColor="accent1"/>
+          <w:sz w:val="28"/>
+          <w:szCs w:val="28"/>
+        </w:rPr>
+        <w:t xml:space="preserve"> 분석표</w:t>
       </w:r>
       <w:bookmarkEnd w:id="0"/>
     </w:p>
@@ -1111,7 +1427,7 @@
           <w:szCs w:val="24"/>
         </w:rPr>
       </w:pPr>
-      <w:bookmarkStart w:id="1" w:name="_Toc237114741"/>
+      <w:bookmarkStart w:id="1" w:name="_Toc237206040"/>
       <w:r>
         <w:rPr>
           <w:rFonts w:hint="eastAsia"/>
@@ -1150,56 +1466,20 @@
           <w:sz w:val="24"/>
           <w:szCs w:val="24"/>
         </w:rPr>
-        <w:t>코어 메카닉스 핵심 요소</w:t>
-      </w:r>
-      <w:bookmarkEnd w:id="1"/>
-    </w:p>
-    <w:p>
-      <w:pPr>
-        <w:ind w:firstLine="240"/>
-        <w:rPr>
-          <w:sz w:val="20"/>
-          <w:szCs w:val="20"/>
-        </w:rPr>
-      </w:pPr>
-      <w:r>
-        <w:rPr>
-          <w:rFonts w:hint="eastAsia"/>
-          <w:sz w:val="20"/>
-          <w:szCs w:val="20"/>
-        </w:rPr>
-        <w:t xml:space="preserve">- </w:t>
-      </w:r>
-      <w:r>
-        <w:rPr>
-          <w:sz w:val="20"/>
-          <w:szCs w:val="20"/>
-        </w:rPr>
-        <w:t>TPS 전투 / 무기·아이템 조합 / 특수 능력 성장 / 잠입·발각 시스템 / 스테이지 탐색</w:t>
-      </w:r>
-    </w:p>
-    <w:p>
-      <w:pPr>
-        <w:ind w:firstLine="240"/>
-        <w:rPr>
-          <w:rFonts w:hint="eastAsia"/>
-          <w:sz w:val="20"/>
-          <w:szCs w:val="20"/>
-        </w:rPr>
-      </w:pPr>
-    </w:p>
-    <w:p>
-      <w:pPr>
-        <w:pStyle w:val="2"/>
-        <w:ind w:leftChars="100" w:left="240"/>
-        <w:rPr>
+        <w:t xml:space="preserve">코어 </w:t>
+      </w:r>
+      <w:proofErr w:type="spellStart"/>
+      <w:r>
+        <w:rPr>
+          <w:rFonts w:hint="eastAsia"/>
           <w:i w:val="0"/>
           <w:iCs w:val="0"/>
           <w:sz w:val="24"/>
           <w:szCs w:val="24"/>
         </w:rPr>
-      </w:pPr>
-      <w:bookmarkStart w:id="2" w:name="_Toc237114742"/>
+        <w:t>메카닉스</w:t>
+      </w:r>
+      <w:proofErr w:type="spellEnd"/>
       <w:r>
         <w:rPr>
           <w:rFonts w:hint="eastAsia"/>
@@ -1208,18 +1488,119 @@
           <w:sz w:val="24"/>
           <w:szCs w:val="24"/>
         </w:rPr>
-        <w:t>1</w:t>
-      </w:r>
-      <w:r>
-        <w:rPr>
-          <w:rFonts w:hint="eastAsia"/>
+        <w:t xml:space="preserve"> 핵심 요소</w:t>
+      </w:r>
+      <w:bookmarkEnd w:id="1"/>
+    </w:p>
+    <w:p>
+      <w:pPr>
+        <w:ind w:firstLine="240"/>
+        <w:rPr>
+          <w:sz w:val="20"/>
+          <w:szCs w:val="20"/>
+        </w:rPr>
+      </w:pPr>
+      <w:r>
+        <w:rPr>
+          <w:rFonts w:hint="eastAsia"/>
+          <w:sz w:val="20"/>
+          <w:szCs w:val="20"/>
+        </w:rPr>
+        <w:t xml:space="preserve">- </w:t>
+      </w:r>
+      <w:r>
+        <w:rPr>
+          <w:sz w:val="20"/>
+          <w:szCs w:val="20"/>
+        </w:rPr>
+        <w:t xml:space="preserve">TPS </w:t>
+      </w:r>
+      <w:proofErr w:type="gramStart"/>
+      <w:r>
+        <w:rPr>
+          <w:sz w:val="20"/>
+          <w:szCs w:val="20"/>
+        </w:rPr>
+        <w:t>전투 /</w:t>
+      </w:r>
+      <w:proofErr w:type="gramEnd"/>
+      <w:r>
+        <w:rPr>
+          <w:sz w:val="20"/>
+          <w:szCs w:val="20"/>
+        </w:rPr>
+        <w:t xml:space="preserve"> 무기·아이템 </w:t>
+      </w:r>
+      <w:proofErr w:type="gramStart"/>
+      <w:r>
+        <w:rPr>
+          <w:sz w:val="20"/>
+          <w:szCs w:val="20"/>
+        </w:rPr>
+        <w:t>조합 /</w:t>
+      </w:r>
+      <w:proofErr w:type="gramEnd"/>
+      <w:r>
+        <w:rPr>
+          <w:sz w:val="20"/>
+          <w:szCs w:val="20"/>
+        </w:rPr>
+        <w:t xml:space="preserve"> 특수 능력 </w:t>
+      </w:r>
+      <w:proofErr w:type="gramStart"/>
+      <w:r>
+        <w:rPr>
+          <w:sz w:val="20"/>
+          <w:szCs w:val="20"/>
+        </w:rPr>
+        <w:t>성장 /</w:t>
+      </w:r>
+      <w:proofErr w:type="gramEnd"/>
+      <w:r>
+        <w:rPr>
+          <w:sz w:val="20"/>
+          <w:szCs w:val="20"/>
+        </w:rPr>
+        <w:t xml:space="preserve"> 잠입·발각 </w:t>
+      </w:r>
+      <w:proofErr w:type="gramStart"/>
+      <w:r>
+        <w:rPr>
+          <w:sz w:val="20"/>
+          <w:szCs w:val="20"/>
+        </w:rPr>
+        <w:t>시스템 /</w:t>
+      </w:r>
+      <w:proofErr w:type="gramEnd"/>
+      <w:r>
+        <w:rPr>
+          <w:sz w:val="20"/>
+          <w:szCs w:val="20"/>
+        </w:rPr>
+        <w:t xml:space="preserve"> 스테이지 탐색</w:t>
+      </w:r>
+    </w:p>
+    <w:p>
+      <w:pPr>
+        <w:ind w:firstLine="240"/>
+        <w:rPr>
+          <w:sz w:val="20"/>
+          <w:szCs w:val="20"/>
+        </w:rPr>
+      </w:pPr>
+    </w:p>
+    <w:p>
+      <w:pPr>
+        <w:pStyle w:val="2"/>
+        <w:ind w:leftChars="100" w:left="240"/>
+        <w:rPr>
           <w:i w:val="0"/>
           <w:iCs w:val="0"/>
           <w:sz w:val="24"/>
           <w:szCs w:val="24"/>
         </w:rPr>
-        <w:t>-1</w:t>
-      </w:r>
+      </w:pPr>
+      <w:bookmarkStart w:id="2" w:name="_Toc237206041"/>
       <w:r>
         <w:rPr>
           <w:rFonts w:hint="eastAsia"/>
@@ -1228,7 +1609,7 @@
           <w:sz w:val="24"/>
           <w:szCs w:val="24"/>
         </w:rPr>
-        <w:t xml:space="preserve"> </w:t>
+        <w:t>1</w:t>
       </w:r>
       <w:r>
         <w:rPr>
@@ -1238,166 +1619,18 @@
           <w:sz w:val="24"/>
           <w:szCs w:val="24"/>
         </w:rPr>
-        <w:t>플레이어가 가장 자주 하는 행동</w:t>
-      </w:r>
-      <w:bookmarkEnd w:id="2"/>
-    </w:p>
-    <w:p>
-      <w:pPr>
-        <w:ind w:firstLine="240"/>
-        <w:rPr>
-          <w:b/>
-          <w:bCs/>
-          <w:sz w:val="20"/>
-          <w:szCs w:val="20"/>
-        </w:rPr>
-      </w:pPr>
-      <w:r>
-        <w:rPr>
-          <w:rFonts w:hint="eastAsia"/>
-          <w:sz w:val="20"/>
-          <w:szCs w:val="20"/>
-        </w:rPr>
-        <w:t xml:space="preserve">- </w:t>
-      </w:r>
-      <w:r>
-        <w:rPr>
-          <w:rFonts w:hint="eastAsia"/>
-          <w:b/>
-          <w:bCs/>
-          <w:sz w:val="20"/>
-          <w:szCs w:val="20"/>
-        </w:rPr>
-        <w:t>전투</w:t>
-      </w:r>
-      <w:r>
-        <w:rPr>
-          <w:rFonts w:hint="eastAsia"/>
-          <w:b/>
-          <w:bCs/>
-          <w:sz w:val="20"/>
-          <w:szCs w:val="20"/>
-        </w:rPr>
-        <w:t xml:space="preserve"> 메카닉 관점</w:t>
-      </w:r>
-      <w:r>
-        <w:rPr>
-          <w:rFonts w:hint="eastAsia"/>
-          <w:sz w:val="20"/>
-          <w:szCs w:val="20"/>
-        </w:rPr>
-        <w:t xml:space="preserve">으로 볼 때 </w:t>
-      </w:r>
-      <w:r>
-        <w:rPr>
-          <w:rFonts w:hint="eastAsia"/>
-          <w:b/>
-          <w:bCs/>
-          <w:sz w:val="20"/>
-          <w:szCs w:val="20"/>
-        </w:rPr>
-        <w:t>이동-&gt; 탐색 -&gt; 조준 -&gt; 공격 -&gt; 회피</w:t>
-      </w:r>
-    </w:p>
-    <w:p>
-      <w:pPr>
-        <w:ind w:firstLine="240"/>
-        <w:rPr>
-          <w:rFonts w:hint="eastAsia"/>
-          <w:sz w:val="20"/>
-          <w:szCs w:val="20"/>
-        </w:rPr>
-      </w:pPr>
-    </w:p>
-    <w:p>
-      <w:pPr>
-        <w:ind w:left="240"/>
-        <w:rPr>
-          <w:b/>
-          <w:bCs/>
-          <w:sz w:val="20"/>
-          <w:szCs w:val="20"/>
-        </w:rPr>
-      </w:pPr>
-      <w:r>
-        <w:rPr>
-          <w:rFonts w:hint="eastAsia"/>
-          <w:sz w:val="20"/>
-          <w:szCs w:val="20"/>
-        </w:rPr>
-        <w:t xml:space="preserve">- </w:t>
-      </w:r>
-      <w:r>
-        <w:rPr>
-          <w:rFonts w:hint="eastAsia"/>
-          <w:b/>
-          <w:bCs/>
-          <w:sz w:val="20"/>
-          <w:szCs w:val="20"/>
-        </w:rPr>
-        <w:t>성장 메카닉 관점</w:t>
-      </w:r>
-      <w:r>
-        <w:rPr>
-          <w:rFonts w:hint="eastAsia"/>
-          <w:sz w:val="20"/>
-          <w:szCs w:val="20"/>
-        </w:rPr>
-        <w:t xml:space="preserve">으로 볼 때 </w:t>
-      </w:r>
-      <w:r>
-        <w:rPr>
-          <w:rFonts w:hint="eastAsia"/>
-          <w:b/>
-          <w:bCs/>
-          <w:sz w:val="20"/>
-          <w:szCs w:val="20"/>
-        </w:rPr>
-        <w:t>전투/탐색 -&gt; 아이템 획득 -&gt; 무기 조합 -&gt; 스테이지 클리어 -&gt; 특수 능력 선택(</w:t>
-      </w:r>
-      <w:r>
-        <w:rPr>
-          <w:rFonts w:hint="eastAsia"/>
-          <w:b/>
-          <w:bCs/>
-          <w:sz w:val="20"/>
-          <w:szCs w:val="20"/>
-        </w:rPr>
-        <w:t>캐릭터 강화</w:t>
-      </w:r>
-      <w:r>
-        <w:rPr>
-          <w:rFonts w:hint="eastAsia"/>
-          <w:b/>
-          <w:bCs/>
-          <w:sz w:val="20"/>
-          <w:szCs w:val="20"/>
-        </w:rPr>
-        <w:t>) -&gt; 다음 전투</w:t>
-      </w:r>
-    </w:p>
-    <w:p>
-      <w:pPr>
-        <w:ind w:left="240"/>
-        <w:rPr>
-          <w:rFonts w:hint="eastAsia"/>
-          <w:sz w:val="20"/>
-          <w:szCs w:val="20"/>
-        </w:rPr>
-      </w:pPr>
-    </w:p>
-    <w:p>
-      <w:pPr>
-        <w:pStyle w:val="2"/>
-        <w:ind w:leftChars="100" w:left="240"/>
-        <w:rPr>
+        <w:t>-1</w:t>
+      </w:r>
+      <w:r>
+        <w:rPr>
+          <w:rFonts w:hint="eastAsia"/>
           <w:i w:val="0"/>
           <w:iCs w:val="0"/>
           <w:sz w:val="24"/>
           <w:szCs w:val="24"/>
         </w:rPr>
-      </w:pPr>
-      <w:bookmarkStart w:id="3" w:name="_Toc237114743"/>
+        <w:t xml:space="preserve"> </w:t>
+      </w:r>
       <w:r>
         <w:rPr>
           <w:rFonts w:hint="eastAsia"/>
@@ -1406,18 +1639,144 @@
           <w:sz w:val="24"/>
           <w:szCs w:val="24"/>
         </w:rPr>
-        <w:t>1</w:t>
-      </w:r>
-      <w:r>
-        <w:rPr>
-          <w:rFonts w:hint="eastAsia"/>
+        <w:t>플레이어가 가장 자주 하는 행동</w:t>
+      </w:r>
+      <w:bookmarkEnd w:id="2"/>
+    </w:p>
+    <w:p>
+      <w:pPr>
+        <w:ind w:firstLine="240"/>
+        <w:rPr>
+          <w:b/>
+          <w:bCs/>
+          <w:sz w:val="20"/>
+          <w:szCs w:val="20"/>
+        </w:rPr>
+      </w:pPr>
+      <w:r>
+        <w:rPr>
+          <w:rFonts w:hint="eastAsia"/>
+          <w:sz w:val="20"/>
+          <w:szCs w:val="20"/>
+        </w:rPr>
+        <w:t xml:space="preserve">- </w:t>
+      </w:r>
+      <w:r>
+        <w:rPr>
+          <w:rFonts w:hint="eastAsia"/>
+          <w:b/>
+          <w:bCs/>
+          <w:sz w:val="20"/>
+          <w:szCs w:val="20"/>
+        </w:rPr>
+        <w:t>전투</w:t>
+      </w:r>
+      <w:r>
+        <w:rPr>
+          <w:rFonts w:hint="eastAsia"/>
+          <w:b/>
+          <w:bCs/>
+          <w:sz w:val="20"/>
+          <w:szCs w:val="20"/>
+        </w:rPr>
+        <w:t xml:space="preserve"> 메카닉 관점</w:t>
+      </w:r>
+      <w:r>
+        <w:rPr>
+          <w:rFonts w:hint="eastAsia"/>
+          <w:sz w:val="20"/>
+          <w:szCs w:val="20"/>
+        </w:rPr>
+        <w:t xml:space="preserve">으로 볼 때 </w:t>
+      </w:r>
+      <w:r>
+        <w:rPr>
+          <w:rFonts w:hint="eastAsia"/>
+          <w:b/>
+          <w:bCs/>
+          <w:sz w:val="20"/>
+          <w:szCs w:val="20"/>
+        </w:rPr>
+        <w:t>이동-&gt; 탐색 -&gt; 조준 -&gt; 공격 -&gt; 회피</w:t>
+      </w:r>
+    </w:p>
+    <w:p>
+      <w:pPr>
+        <w:ind w:firstLine="240"/>
+        <w:rPr>
+          <w:sz w:val="20"/>
+          <w:szCs w:val="20"/>
+        </w:rPr>
+      </w:pPr>
+    </w:p>
+    <w:p>
+      <w:pPr>
+        <w:ind w:left="240"/>
+        <w:rPr>
+          <w:b/>
+          <w:bCs/>
+          <w:sz w:val="20"/>
+          <w:szCs w:val="20"/>
+        </w:rPr>
+      </w:pPr>
+      <w:r>
+        <w:rPr>
+          <w:rFonts w:hint="eastAsia"/>
+          <w:sz w:val="20"/>
+          <w:szCs w:val="20"/>
+        </w:rPr>
+        <w:t xml:space="preserve">- </w:t>
+      </w:r>
+      <w:r>
+        <w:rPr>
+          <w:rFonts w:hint="eastAsia"/>
+          <w:b/>
+          <w:bCs/>
+          <w:sz w:val="20"/>
+          <w:szCs w:val="20"/>
+        </w:rPr>
+        <w:t>성장 메카닉 관점</w:t>
+      </w:r>
+      <w:r>
+        <w:rPr>
+          <w:rFonts w:hint="eastAsia"/>
+          <w:sz w:val="20"/>
+          <w:szCs w:val="20"/>
+        </w:rPr>
+        <w:t xml:space="preserve">으로 볼 때 </w:t>
+      </w:r>
+      <w:r>
+        <w:rPr>
+          <w:rFonts w:hint="eastAsia"/>
+          <w:b/>
+          <w:bCs/>
+          <w:sz w:val="20"/>
+          <w:szCs w:val="20"/>
+        </w:rPr>
+        <w:t>전투/탐색 -&gt; 아이템 획득 -&gt; 무기 조합 -&gt; 스테이지 클리어 -&gt; 특수 능력 선택(캐릭터 강화) -&gt; 다음 전투</w:t>
+      </w:r>
+    </w:p>
+    <w:p>
+      <w:pPr>
+        <w:ind w:left="240"/>
+        <w:rPr>
+          <w:sz w:val="20"/>
+          <w:szCs w:val="20"/>
+        </w:rPr>
+      </w:pPr>
+    </w:p>
+    <w:p>
+      <w:pPr>
+        <w:pStyle w:val="2"/>
+        <w:ind w:leftChars="100" w:left="240"/>
+        <w:rPr>
           <w:i w:val="0"/>
           <w:iCs w:val="0"/>
           <w:sz w:val="24"/>
           <w:szCs w:val="24"/>
         </w:rPr>
-        <w:t>-</w:t>
-      </w:r>
+      </w:pPr>
+      <w:bookmarkStart w:id="3" w:name="_Toc237206042"/>
       <w:r>
         <w:rPr>
           <w:rFonts w:hint="eastAsia"/>
@@ -1426,7 +1785,7 @@
           <w:sz w:val="24"/>
           <w:szCs w:val="24"/>
         </w:rPr>
-        <w:t>2</w:t>
+        <w:t>1</w:t>
       </w:r>
       <w:r>
         <w:rPr>
@@ -1436,7 +1795,7 @@
           <w:sz w:val="24"/>
           <w:szCs w:val="24"/>
         </w:rPr>
-        <w:t xml:space="preserve"> </w:t>
+        <w:t>-2</w:t>
       </w:r>
       <w:r>
         <w:rPr>
@@ -1446,116 +1805,9 @@
           <w:sz w:val="24"/>
           <w:szCs w:val="24"/>
         </w:rPr>
-        <w:t>그 행동이 필요한 이유</w:t>
-      </w:r>
-      <w:bookmarkEnd w:id="3"/>
-    </w:p>
-    <w:p>
-      <w:pPr>
-        <w:ind w:leftChars="100" w:left="240"/>
-        <w:rPr>
-          <w:sz w:val="20"/>
-          <w:szCs w:val="20"/>
-        </w:rPr>
-      </w:pPr>
-      <w:r>
-        <w:rPr>
-          <w:rFonts w:hint="eastAsia"/>
-          <w:sz w:val="20"/>
-          <w:szCs w:val="20"/>
-        </w:rPr>
-        <w:t xml:space="preserve">- </w:t>
-      </w:r>
-      <w:r>
-        <w:rPr>
-          <w:rFonts w:hint="eastAsia"/>
-          <w:b/>
-          <w:bCs/>
-          <w:sz w:val="20"/>
-          <w:szCs w:val="20"/>
-        </w:rPr>
-        <w:t>전투를 하는 이유</w:t>
-      </w:r>
-      <w:r>
-        <w:rPr>
-          <w:rFonts w:hint="eastAsia"/>
-          <w:sz w:val="20"/>
-          <w:szCs w:val="20"/>
-        </w:rPr>
-        <w:t xml:space="preserve">는 </w:t>
-      </w:r>
-      <w:r>
-        <w:rPr>
-          <w:rFonts w:hint="eastAsia"/>
-          <w:sz w:val="20"/>
-          <w:szCs w:val="20"/>
-        </w:rPr>
-        <w:t xml:space="preserve">친구를 </w:t>
-      </w:r>
-      <w:r>
-        <w:rPr>
-          <w:rFonts w:hint="eastAsia"/>
-          <w:sz w:val="20"/>
-          <w:szCs w:val="20"/>
-        </w:rPr>
-        <w:t>구출해야 하</w:t>
-      </w:r>
-      <w:r>
-        <w:rPr>
-          <w:sz w:val="20"/>
-          <w:szCs w:val="20"/>
-        </w:rPr>
-        <w:t>는</w:t>
-      </w:r>
-      <w:r>
-        <w:rPr>
-          <w:rFonts w:hint="eastAsia"/>
-          <w:sz w:val="20"/>
-          <w:szCs w:val="20"/>
-        </w:rPr>
-        <w:t xml:space="preserve"> 핵심 목표가 있기 때문이고 </w:t>
-      </w:r>
-      <w:r>
-        <w:rPr>
-          <w:rFonts w:hint="eastAsia"/>
-          <w:b/>
-          <w:bCs/>
-          <w:sz w:val="20"/>
-          <w:szCs w:val="20"/>
-        </w:rPr>
-        <w:t>성장이 필요한 이유</w:t>
-      </w:r>
-      <w:r>
-        <w:rPr>
-          <w:rFonts w:hint="eastAsia"/>
-          <w:sz w:val="20"/>
-          <w:szCs w:val="20"/>
-        </w:rPr>
-        <w:t>는</w:t>
-      </w:r>
-      <w:r>
-        <w:rPr>
-          <w:rFonts w:hint="eastAsia"/>
-          <w:sz w:val="20"/>
-          <w:szCs w:val="20"/>
-        </w:rPr>
-        <w:t xml:space="preserve"> 스테이지가 올라갈수록 난이도가 급격히 올라가기 때문입니다.</w:t>
-      </w:r>
-    </w:p>
-    <w:p>
-      <w:pPr>
-        <w:ind w:leftChars="100" w:left="240"/>
-        <w:rPr>
-          <w:rFonts w:hint="eastAsia"/>
-          <w:sz w:val="20"/>
-          <w:szCs w:val="20"/>
-        </w:rPr>
-      </w:pPr>
-    </w:p>
-    <w:p>
-      <w:pPr>
-        <w:pStyle w:val="2"/>
-        <w:ind w:leftChars="100" w:left="240"/>
+        <w:t xml:space="preserve"> </w:t>
+      </w:r>
+      <w:r>
         <w:rPr>
           <w:rFonts w:hint="eastAsia"/>
           <w:i w:val="0"/>
@@ -1563,18 +1815,123 @@
           <w:sz w:val="24"/>
           <w:szCs w:val="24"/>
         </w:rPr>
-      </w:pPr>
-      <w:bookmarkStart w:id="4" w:name="_Toc237114744"/>
-      <w:r>
-        <w:rPr>
-          <w:rFonts w:hint="eastAsia"/>
+        <w:t>그 행동이 필요한 이유</w:t>
+      </w:r>
+      <w:bookmarkEnd w:id="3"/>
+    </w:p>
+    <w:p>
+      <w:pPr>
+        <w:ind w:leftChars="100" w:left="240"/>
+        <w:rPr>
+          <w:sz w:val="20"/>
+          <w:szCs w:val="20"/>
+        </w:rPr>
+      </w:pPr>
+      <w:r>
+        <w:rPr>
+          <w:rFonts w:hint="eastAsia"/>
+          <w:sz w:val="20"/>
+          <w:szCs w:val="20"/>
+        </w:rPr>
+        <w:t xml:space="preserve">- </w:t>
+      </w:r>
+      <w:r>
+        <w:rPr>
+          <w:rFonts w:hint="eastAsia"/>
+          <w:b/>
+          <w:bCs/>
+          <w:sz w:val="20"/>
+          <w:szCs w:val="20"/>
+        </w:rPr>
+        <w:t>전투를 하는 이유</w:t>
+      </w:r>
+      <w:r>
+        <w:rPr>
+          <w:rFonts w:hint="eastAsia"/>
+          <w:sz w:val="20"/>
+          <w:szCs w:val="20"/>
+        </w:rPr>
+        <w:t xml:space="preserve">는 </w:t>
+      </w:r>
+      <w:r>
+        <w:rPr>
+          <w:rFonts w:hint="eastAsia"/>
+          <w:sz w:val="20"/>
+          <w:szCs w:val="20"/>
+        </w:rPr>
+        <w:t xml:space="preserve">친구를 </w:t>
+      </w:r>
+      <w:r>
+        <w:rPr>
+          <w:rFonts w:hint="eastAsia"/>
+          <w:sz w:val="20"/>
+          <w:szCs w:val="20"/>
+        </w:rPr>
+        <w:t>구출해야 하</w:t>
+      </w:r>
+      <w:r>
+        <w:rPr>
+          <w:sz w:val="20"/>
+          <w:szCs w:val="20"/>
+        </w:rPr>
+        <w:t>는</w:t>
+      </w:r>
+      <w:r>
+        <w:rPr>
+          <w:rFonts w:hint="eastAsia"/>
+          <w:sz w:val="20"/>
+          <w:szCs w:val="20"/>
+        </w:rPr>
+        <w:t xml:space="preserve"> 핵심 목표가 있기 때문이고 </w:t>
+      </w:r>
+      <w:r>
+        <w:rPr>
+          <w:rFonts w:hint="eastAsia"/>
+          <w:b/>
+          <w:bCs/>
+          <w:sz w:val="20"/>
+          <w:szCs w:val="20"/>
+        </w:rPr>
+        <w:t>성장이 필요한 이유</w:t>
+      </w:r>
+      <w:r>
+        <w:rPr>
+          <w:rFonts w:hint="eastAsia"/>
+          <w:sz w:val="20"/>
+          <w:szCs w:val="20"/>
+        </w:rPr>
+        <w:t>는</w:t>
+      </w:r>
+      <w:r>
+        <w:rPr>
+          <w:rFonts w:hint="eastAsia"/>
+          <w:sz w:val="20"/>
+          <w:szCs w:val="20"/>
+        </w:rPr>
+        <w:t xml:space="preserve"> 스테이지가 올라갈수록 난이도가 급격히 올라가기 때문입니다.</w:t>
+      </w:r>
+    </w:p>
+    <w:p>
+      <w:pPr>
+        <w:ind w:leftChars="100" w:left="240"/>
+        <w:rPr>
+          <w:sz w:val="20"/>
+          <w:szCs w:val="20"/>
+        </w:rPr>
+      </w:pPr>
+    </w:p>
+    <w:p>
+      <w:pPr>
+        <w:pStyle w:val="2"/>
+        <w:ind w:leftChars="100" w:left="240"/>
+        <w:rPr>
           <w:i w:val="0"/>
           <w:iCs w:val="0"/>
           <w:sz w:val="24"/>
           <w:szCs w:val="24"/>
         </w:rPr>
-        <w:t>1</w:t>
-      </w:r>
+      </w:pPr>
+      <w:bookmarkStart w:id="4" w:name="_Toc237206043"/>
       <w:r>
         <w:rPr>
           <w:rFonts w:hint="eastAsia"/>
@@ -1583,7 +1940,7 @@
           <w:sz w:val="24"/>
           <w:szCs w:val="24"/>
         </w:rPr>
-        <w:t>-</w:t>
+        <w:t>1</w:t>
       </w:r>
       <w:r>
         <w:rPr>
@@ -1593,7 +1950,7 @@
           <w:sz w:val="24"/>
           <w:szCs w:val="24"/>
         </w:rPr>
-        <w:t>3 행동을 시작하는 입력</w:t>
+        <w:t>-3 행동을 시작하는 입력</w:t>
       </w:r>
       <w:bookmarkEnd w:id="4"/>
     </w:p>
@@ -1645,30 +2002,13 @@
           <w:sz w:val="20"/>
           <w:szCs w:val="20"/>
         </w:rPr>
-        <w:t xml:space="preserve"> 비주얼 노벨로 스토리가 진행되고 스토리가 끝나면 </w:t>
-      </w:r>
-      <w:r>
-        <w:rPr>
-          <w:rFonts w:hint="eastAsia"/>
-          <w:sz w:val="20"/>
-          <w:szCs w:val="20"/>
-        </w:rPr>
-        <w:t xml:space="preserve">TPS </w:t>
-      </w:r>
-      <w:r>
-        <w:rPr>
-          <w:rFonts w:hint="eastAsia"/>
-          <w:sz w:val="20"/>
-          <w:szCs w:val="20"/>
-        </w:rPr>
-        <w:t>화면으로 전환되고 미션이 주어지게 됩니다.</w:t>
+        <w:t xml:space="preserve"> 비주얼 노벨로 스토리가 진행되고 스토리가 끝나면 TPS 화면으로 전환되고 미션이 주어지게 됩니다.</w:t>
       </w:r>
     </w:p>
     <w:p>
       <w:pPr>
         <w:ind w:leftChars="100" w:left="240"/>
         <w:rPr>
-          <w:rFonts w:hint="eastAsia"/>
           <w:sz w:val="20"/>
           <w:szCs w:val="20"/>
         </w:rPr>
@@ -1679,14 +2019,13 @@
         <w:pStyle w:val="2"/>
         <w:ind w:leftChars="100" w:left="240"/>
         <w:rPr>
-          <w:rFonts w:hint="eastAsia"/>
           <w:i w:val="0"/>
           <w:iCs w:val="0"/>
           <w:sz w:val="24"/>
           <w:szCs w:val="24"/>
         </w:rPr>
       </w:pPr>
-      <w:bookmarkStart w:id="5" w:name="_Toc237114745"/>
+      <w:bookmarkStart w:id="5" w:name="_Toc237206044"/>
       <w:r>
         <w:rPr>
           <w:rFonts w:hint="eastAsia"/>
@@ -1705,280 +2044,378 @@
           <w:sz w:val="24"/>
           <w:szCs w:val="24"/>
         </w:rPr>
+        <w:t>-4 행동 후 나타나는 출력</w:t>
+      </w:r>
+      <w:bookmarkEnd w:id="5"/>
+    </w:p>
+    <w:p>
+      <w:pPr>
+        <w:ind w:leftChars="100" w:left="240"/>
+        <w:rPr>
+          <w:b/>
+          <w:bCs/>
+          <w:sz w:val="20"/>
+          <w:szCs w:val="20"/>
+        </w:rPr>
+      </w:pPr>
+      <w:r>
+        <w:rPr>
+          <w:rFonts w:hint="eastAsia"/>
+          <w:sz w:val="20"/>
+          <w:szCs w:val="20"/>
+        </w:rPr>
         <w:t>-</w:t>
       </w:r>
       <w:r>
         <w:rPr>
           <w:rFonts w:hint="eastAsia"/>
+          <w:sz w:val="20"/>
+          <w:szCs w:val="20"/>
+        </w:rPr>
+        <w:t xml:space="preserve"> 미션을 클리어하고 해당 스테이지내에 적을 다 처치하면 특수 능력 선택과 다음 스테이지에 넘어갈 수 있는 기회가 주어</w:t>
+      </w:r>
+      <w:r>
+        <w:rPr>
+          <w:rFonts w:hint="eastAsia"/>
+          <w:sz w:val="20"/>
+          <w:szCs w:val="20"/>
+        </w:rPr>
+        <w:t>집니다.</w:t>
+      </w:r>
+      <w:r>
+        <w:rPr>
+          <w:rFonts w:hint="eastAsia"/>
+          <w:sz w:val="20"/>
+          <w:szCs w:val="20"/>
+        </w:rPr>
+        <w:t xml:space="preserve"> (</w:t>
+      </w:r>
+      <w:r>
+        <w:rPr>
+          <w:rFonts w:hint="eastAsia"/>
+          <w:b/>
+          <w:bCs/>
+          <w:sz w:val="20"/>
+          <w:szCs w:val="20"/>
+        </w:rPr>
+        <w:t>특수 능력 선택 같은 경우 기계를 통해 선택하고 다음 스테이지 이동은 웨이 포인트로 길을 안내합니다.)</w:t>
+      </w:r>
+    </w:p>
+    <w:p>
+      <w:pPr>
+        <w:ind w:leftChars="100" w:left="240"/>
+      </w:pPr>
+    </w:p>
+    <w:p>
+      <w:pPr>
+        <w:ind w:leftChars="100" w:left="240"/>
+        <w:rPr>
+          <w:b/>
+          <w:bCs/>
+          <w:sz w:val="20"/>
+          <w:szCs w:val="20"/>
+        </w:rPr>
+      </w:pPr>
+      <w:r>
+        <w:rPr>
+          <w:rFonts w:hint="eastAsia"/>
+          <w:sz w:val="20"/>
+          <w:szCs w:val="20"/>
+        </w:rPr>
+        <w:t>-</w:t>
+      </w:r>
+      <w:r>
+        <w:rPr>
+          <w:rFonts w:hint="eastAsia"/>
+          <w:sz w:val="20"/>
+          <w:szCs w:val="20"/>
+        </w:rPr>
+        <w:t xml:space="preserve"> 적에게 죽게 되거나 제한시간이 있는 미션에서 실패할 경우 </w:t>
+      </w:r>
+      <w:r>
+        <w:rPr>
+          <w:rFonts w:hint="eastAsia"/>
+          <w:sz w:val="20"/>
+          <w:szCs w:val="20"/>
+        </w:rPr>
+        <w:t xml:space="preserve">10초동안 </w:t>
+      </w:r>
+      <w:r>
+        <w:rPr>
+          <w:rFonts w:hint="eastAsia"/>
+          <w:b/>
+          <w:bCs/>
+          <w:sz w:val="20"/>
+          <w:szCs w:val="20"/>
+        </w:rPr>
+        <w:t xml:space="preserve">3장의 </w:t>
+      </w:r>
+      <w:proofErr w:type="spellStart"/>
+      <w:r>
+        <w:rPr>
+          <w:rFonts w:hint="eastAsia"/>
+          <w:b/>
+          <w:bCs/>
+          <w:sz w:val="20"/>
+          <w:szCs w:val="20"/>
+        </w:rPr>
+        <w:t>패널티</w:t>
+      </w:r>
+      <w:proofErr w:type="spellEnd"/>
+      <w:r>
+        <w:rPr>
+          <w:rFonts w:hint="eastAsia"/>
+          <w:b/>
+          <w:bCs/>
+          <w:sz w:val="20"/>
+          <w:szCs w:val="20"/>
+        </w:rPr>
+        <w:t xml:space="preserve"> 카드(예시: 체력 -15</w:t>
+      </w:r>
+      <w:proofErr w:type="gramStart"/>
+      <w:r>
+        <w:rPr>
+          <w:rFonts w:hint="eastAsia"/>
+          <w:b/>
+          <w:bCs/>
+          <w:sz w:val="20"/>
+          <w:szCs w:val="20"/>
+        </w:rPr>
+        <w:t>%</w:t>
+      </w:r>
+      <w:r>
+        <w:rPr>
+          <w:rFonts w:hint="eastAsia"/>
+          <w:b/>
+          <w:bCs/>
+          <w:sz w:val="20"/>
+          <w:szCs w:val="20"/>
+        </w:rPr>
+        <w:t xml:space="preserve"> /</w:t>
+      </w:r>
+      <w:proofErr w:type="gramEnd"/>
+      <w:r>
+        <w:rPr>
+          <w:rFonts w:hint="eastAsia"/>
+          <w:b/>
+          <w:bCs/>
+          <w:sz w:val="20"/>
+          <w:szCs w:val="20"/>
+        </w:rPr>
+        <w:t xml:space="preserve"> </w:t>
+      </w:r>
+      <w:r>
+        <w:rPr>
+          <w:rFonts w:hint="eastAsia"/>
+          <w:b/>
+          <w:bCs/>
+          <w:sz w:val="20"/>
+          <w:szCs w:val="20"/>
+        </w:rPr>
+        <w:t xml:space="preserve">획득한 아이템 1개 랜덤 </w:t>
+      </w:r>
+      <w:proofErr w:type="gramStart"/>
+      <w:r>
+        <w:rPr>
+          <w:rFonts w:hint="eastAsia"/>
+          <w:b/>
+          <w:bCs/>
+          <w:sz w:val="20"/>
+          <w:szCs w:val="20"/>
+        </w:rPr>
+        <w:t>제거</w:t>
+      </w:r>
+      <w:r>
+        <w:rPr>
+          <w:rFonts w:hint="eastAsia"/>
+          <w:b/>
+          <w:bCs/>
+          <w:sz w:val="20"/>
+          <w:szCs w:val="20"/>
+        </w:rPr>
+        <w:t xml:space="preserve"> /</w:t>
+      </w:r>
+      <w:proofErr w:type="gramEnd"/>
+      <w:r>
+        <w:rPr>
+          <w:rFonts w:hint="eastAsia"/>
+          <w:b/>
+          <w:bCs/>
+          <w:sz w:val="20"/>
+          <w:szCs w:val="20"/>
+        </w:rPr>
+        <w:t xml:space="preserve"> </w:t>
+      </w:r>
+      <w:r>
+        <w:rPr>
+          <w:rFonts w:hint="eastAsia"/>
+          <w:b/>
+          <w:bCs/>
+          <w:sz w:val="20"/>
+          <w:szCs w:val="20"/>
+        </w:rPr>
+        <w:t>랜덤으로 무기 공격력 -10%)</w:t>
+      </w:r>
+      <w:r>
+        <w:rPr>
+          <w:rFonts w:hint="eastAsia"/>
+          <w:b/>
+          <w:bCs/>
+          <w:sz w:val="20"/>
+          <w:szCs w:val="20"/>
+        </w:rPr>
+        <w:t>중 하나를</w:t>
+      </w:r>
+      <w:r>
+        <w:rPr>
+          <w:rFonts w:hint="eastAsia"/>
+          <w:b/>
+          <w:bCs/>
+          <w:sz w:val="20"/>
+          <w:szCs w:val="20"/>
+        </w:rPr>
+        <w:t xml:space="preserve"> </w:t>
+      </w:r>
+      <w:r>
+        <w:rPr>
+          <w:rFonts w:hint="eastAsia"/>
+          <w:b/>
+          <w:bCs/>
+          <w:sz w:val="20"/>
+          <w:szCs w:val="20"/>
+        </w:rPr>
+        <w:t>선택</w:t>
+      </w:r>
+      <w:r>
+        <w:rPr>
+          <w:rFonts w:hint="eastAsia"/>
+          <w:b/>
+          <w:bCs/>
+          <w:sz w:val="20"/>
+          <w:szCs w:val="20"/>
+        </w:rPr>
+        <w:t xml:space="preserve">하는 </w:t>
+      </w:r>
+      <w:proofErr w:type="spellStart"/>
+      <w:r>
+        <w:rPr>
+          <w:rFonts w:hint="eastAsia"/>
+          <w:b/>
+          <w:bCs/>
+          <w:sz w:val="20"/>
+          <w:szCs w:val="20"/>
+        </w:rPr>
+        <w:t>패널티가</w:t>
+      </w:r>
+      <w:proofErr w:type="spellEnd"/>
+      <w:r>
+        <w:rPr>
+          <w:rFonts w:hint="eastAsia"/>
+          <w:sz w:val="20"/>
+          <w:szCs w:val="20"/>
+        </w:rPr>
+        <w:t xml:space="preserve"> </w:t>
+      </w:r>
+      <w:r>
+        <w:rPr>
+          <w:rFonts w:hint="eastAsia"/>
+          <w:sz w:val="20"/>
+          <w:szCs w:val="20"/>
+        </w:rPr>
+        <w:t xml:space="preserve">주어지며 </w:t>
+      </w:r>
+      <w:proofErr w:type="spellStart"/>
+      <w:r>
+        <w:rPr>
+          <w:rFonts w:hint="eastAsia"/>
+          <w:b/>
+          <w:bCs/>
+          <w:sz w:val="20"/>
+          <w:szCs w:val="20"/>
+        </w:rPr>
+        <w:t>패널티</w:t>
+      </w:r>
+      <w:proofErr w:type="spellEnd"/>
+      <w:r>
+        <w:rPr>
+          <w:rFonts w:hint="eastAsia"/>
+          <w:b/>
+          <w:bCs/>
+          <w:sz w:val="20"/>
+          <w:szCs w:val="20"/>
+        </w:rPr>
+        <w:t xml:space="preserve"> 적용이 안된 데이터는 유지</w:t>
+      </w:r>
+      <w:r>
+        <w:rPr>
+          <w:rFonts w:hint="eastAsia"/>
+          <w:b/>
+          <w:bCs/>
+          <w:sz w:val="20"/>
+          <w:szCs w:val="20"/>
+        </w:rPr>
+        <w:t>된 채</w:t>
+      </w:r>
+      <w:r>
+        <w:rPr>
+          <w:rFonts w:hint="eastAsia"/>
+          <w:b/>
+          <w:bCs/>
+          <w:sz w:val="20"/>
+          <w:szCs w:val="20"/>
+        </w:rPr>
+        <w:t xml:space="preserve"> 해당 스테이지로 </w:t>
+      </w:r>
+      <w:proofErr w:type="spellStart"/>
+      <w:r>
+        <w:rPr>
+          <w:rFonts w:hint="eastAsia"/>
+          <w:b/>
+          <w:bCs/>
+          <w:sz w:val="20"/>
+          <w:szCs w:val="20"/>
+        </w:rPr>
+        <w:t>스폰하게</w:t>
+      </w:r>
+      <w:proofErr w:type="spellEnd"/>
+      <w:r>
+        <w:rPr>
+          <w:rFonts w:hint="eastAsia"/>
+          <w:b/>
+          <w:bCs/>
+          <w:sz w:val="20"/>
+          <w:szCs w:val="20"/>
+        </w:rPr>
+        <w:t xml:space="preserve"> 됩니다.</w:t>
+      </w:r>
+    </w:p>
+    <w:p>
+      <w:pPr>
+        <w:ind w:leftChars="100" w:left="240"/>
+      </w:pPr>
+    </w:p>
+    <w:p>
+      <w:pPr>
+        <w:pStyle w:val="2"/>
+        <w:ind w:leftChars="100" w:left="240"/>
+        <w:rPr>
           <w:i w:val="0"/>
           <w:iCs w:val="0"/>
           <w:sz w:val="24"/>
           <w:szCs w:val="24"/>
         </w:rPr>
-        <w:t>4 행동 후 나타나는 출력</w:t>
-      </w:r>
-      <w:bookmarkEnd w:id="5"/>
-    </w:p>
-    <w:p>
-      <w:pPr>
-        <w:ind w:leftChars="100" w:left="240"/>
-        <w:rPr>
-          <w:b/>
-          <w:bCs/>
-          <w:sz w:val="20"/>
-          <w:szCs w:val="20"/>
-        </w:rPr>
-      </w:pPr>
-      <w:r>
-        <w:rPr>
-          <w:rFonts w:hint="eastAsia"/>
-          <w:sz w:val="20"/>
-          <w:szCs w:val="20"/>
-        </w:rPr>
-        <w:t>-</w:t>
-      </w:r>
-      <w:r>
-        <w:rPr>
-          <w:rFonts w:hint="eastAsia"/>
-          <w:sz w:val="20"/>
-          <w:szCs w:val="20"/>
-        </w:rPr>
-        <w:t xml:space="preserve"> </w:t>
-      </w:r>
-      <w:r>
-        <w:rPr>
-          <w:rFonts w:hint="eastAsia"/>
-          <w:sz w:val="20"/>
-          <w:szCs w:val="20"/>
-        </w:rPr>
-        <w:t>미션을 클리어하고 해당 스테이지내에 적을 다 처치하면 특수 능력 선택과 다음 스테이지에 넘어갈 수 있는 기회가 주어</w:t>
-      </w:r>
-      <w:r>
-        <w:rPr>
-          <w:rFonts w:hint="eastAsia"/>
-          <w:sz w:val="20"/>
-          <w:szCs w:val="20"/>
-        </w:rPr>
-        <w:t>집니다.</w:t>
-      </w:r>
-      <w:r>
-        <w:rPr>
-          <w:rFonts w:hint="eastAsia"/>
-          <w:sz w:val="20"/>
-          <w:szCs w:val="20"/>
-        </w:rPr>
-        <w:t xml:space="preserve"> (</w:t>
-      </w:r>
-      <w:r>
-        <w:rPr>
-          <w:rFonts w:hint="eastAsia"/>
-          <w:b/>
-          <w:bCs/>
-          <w:sz w:val="20"/>
-          <w:szCs w:val="20"/>
-        </w:rPr>
-        <w:t>특수 능력 선택 같은 경우 기계를 통해 선택하고 다음 스테이지 이동은 웨이 포인트로 길을 안내합니다.)</w:t>
-      </w:r>
-    </w:p>
-    <w:p>
-      <w:pPr>
-        <w:ind w:leftChars="100" w:left="240"/>
-        <w:rPr>
-          <w:rFonts w:hint="eastAsia"/>
-        </w:rPr>
-      </w:pPr>
-    </w:p>
-    <w:p>
-      <w:pPr>
-        <w:ind w:leftChars="100" w:left="240"/>
-        <w:rPr>
-          <w:b/>
-          <w:bCs/>
-          <w:sz w:val="20"/>
-          <w:szCs w:val="20"/>
-        </w:rPr>
-      </w:pPr>
-      <w:r>
-        <w:rPr>
-          <w:rFonts w:hint="eastAsia"/>
-          <w:sz w:val="20"/>
-          <w:szCs w:val="20"/>
-        </w:rPr>
-        <w:t>-</w:t>
-      </w:r>
-      <w:r>
-        <w:rPr>
-          <w:rFonts w:hint="eastAsia"/>
-          <w:sz w:val="20"/>
-          <w:szCs w:val="20"/>
-        </w:rPr>
-        <w:t xml:space="preserve"> 적에게 죽게 되거나 제한시간이 있는 미션에서 실패할 경우 </w:t>
-      </w:r>
-      <w:r>
-        <w:rPr>
-          <w:rFonts w:hint="eastAsia"/>
-          <w:sz w:val="20"/>
-          <w:szCs w:val="20"/>
-        </w:rPr>
-        <w:t xml:space="preserve">10초동안 </w:t>
-      </w:r>
-      <w:r>
-        <w:rPr>
-          <w:rFonts w:hint="eastAsia"/>
-          <w:b/>
-          <w:bCs/>
-          <w:sz w:val="20"/>
-          <w:szCs w:val="20"/>
-        </w:rPr>
-        <w:t>3장의 패널티 카드(예시: 체력 -15%</w:t>
-      </w:r>
-      <w:r>
-        <w:rPr>
-          <w:rFonts w:hint="eastAsia"/>
-          <w:b/>
-          <w:bCs/>
-          <w:sz w:val="20"/>
-          <w:szCs w:val="20"/>
-        </w:rPr>
-        <w:t xml:space="preserve"> / </w:t>
-      </w:r>
-      <w:r>
-        <w:rPr>
-          <w:rFonts w:hint="eastAsia"/>
-          <w:b/>
-          <w:bCs/>
-          <w:sz w:val="20"/>
-          <w:szCs w:val="20"/>
-        </w:rPr>
-        <w:t>획득한 아이템 1개 랜덤 제거</w:t>
-      </w:r>
-      <w:r>
-        <w:rPr>
-          <w:rFonts w:hint="eastAsia"/>
-          <w:b/>
-          <w:bCs/>
-          <w:sz w:val="20"/>
-          <w:szCs w:val="20"/>
-        </w:rPr>
-        <w:t xml:space="preserve"> / </w:t>
-      </w:r>
-      <w:r>
-        <w:rPr>
-          <w:rFonts w:hint="eastAsia"/>
-          <w:b/>
-          <w:bCs/>
-          <w:sz w:val="20"/>
-          <w:szCs w:val="20"/>
-        </w:rPr>
-        <w:t>랜덤으로 무기 공격력 -10%)</w:t>
-      </w:r>
-      <w:r>
-        <w:rPr>
-          <w:rFonts w:hint="eastAsia"/>
-          <w:b/>
-          <w:bCs/>
-          <w:sz w:val="20"/>
-          <w:szCs w:val="20"/>
-        </w:rPr>
-        <w:t>중 하나를</w:t>
-      </w:r>
-      <w:r>
-        <w:rPr>
-          <w:rFonts w:hint="eastAsia"/>
-          <w:b/>
-          <w:bCs/>
-          <w:sz w:val="20"/>
-          <w:szCs w:val="20"/>
-        </w:rPr>
-        <w:t xml:space="preserve"> </w:t>
-      </w:r>
-      <w:r>
-        <w:rPr>
-          <w:rFonts w:hint="eastAsia"/>
-          <w:b/>
-          <w:bCs/>
-          <w:sz w:val="20"/>
-          <w:szCs w:val="20"/>
-        </w:rPr>
-        <w:t>선택</w:t>
-      </w:r>
-      <w:r>
-        <w:rPr>
-          <w:rFonts w:hint="eastAsia"/>
-          <w:b/>
-          <w:bCs/>
-          <w:sz w:val="20"/>
-          <w:szCs w:val="20"/>
-        </w:rPr>
-        <w:t>하는 패널티가</w:t>
-      </w:r>
-      <w:r>
-        <w:rPr>
-          <w:rFonts w:hint="eastAsia"/>
-          <w:sz w:val="20"/>
-          <w:szCs w:val="20"/>
-        </w:rPr>
-        <w:t xml:space="preserve"> </w:t>
-      </w:r>
-      <w:r>
-        <w:rPr>
-          <w:rFonts w:hint="eastAsia"/>
-          <w:sz w:val="20"/>
-          <w:szCs w:val="20"/>
-        </w:rPr>
-        <w:t xml:space="preserve">주어지며 </w:t>
-      </w:r>
-      <w:r>
-        <w:rPr>
-          <w:rFonts w:hint="eastAsia"/>
-          <w:b/>
-          <w:bCs/>
-          <w:sz w:val="20"/>
-          <w:szCs w:val="20"/>
-        </w:rPr>
-        <w:t>패널티 적용이 안된 데이터는 유지</w:t>
-      </w:r>
-      <w:r>
-        <w:rPr>
-          <w:rFonts w:hint="eastAsia"/>
-          <w:b/>
-          <w:bCs/>
-          <w:sz w:val="20"/>
-          <w:szCs w:val="20"/>
-        </w:rPr>
-        <w:t>된 채</w:t>
-      </w:r>
-      <w:r>
-        <w:rPr>
-          <w:rFonts w:hint="eastAsia"/>
-          <w:b/>
-          <w:bCs/>
-          <w:sz w:val="20"/>
-          <w:szCs w:val="20"/>
-        </w:rPr>
-        <w:t xml:space="preserve"> 해당 스테이지로 스폰하게 됩니다.</w:t>
-      </w:r>
-    </w:p>
-    <w:p>
-      <w:pPr>
-        <w:ind w:leftChars="100" w:left="240"/>
-        <w:rPr>
-          <w:rFonts w:hint="eastAsia"/>
-        </w:rPr>
-      </w:pPr>
-    </w:p>
-    <w:p>
-      <w:pPr>
-        <w:pStyle w:val="2"/>
-        <w:ind w:leftChars="100" w:left="240"/>
-        <w:rPr>
+      </w:pPr>
+      <w:bookmarkStart w:id="6" w:name="_Toc237206045"/>
+      <w:r>
+        <w:rPr>
+          <w:rFonts w:hint="eastAsia"/>
           <w:i w:val="0"/>
           <w:iCs w:val="0"/>
           <w:sz w:val="24"/>
           <w:szCs w:val="24"/>
         </w:rPr>
-      </w:pPr>
-      <w:bookmarkStart w:id="6" w:name="_Toc237114746"/>
+        <w:t>1</w:t>
+      </w:r>
       <w:r>
         <w:rPr>
           <w:rFonts w:hint="eastAsia"/>
@@ -1987,18 +2424,139 @@
           <w:sz w:val="24"/>
           <w:szCs w:val="24"/>
         </w:rPr>
-        <w:t>1</w:t>
-      </w:r>
-      <w:r>
-        <w:rPr>
-          <w:rFonts w:hint="eastAsia"/>
+        <w:t>-5 성공 조건</w:t>
+      </w:r>
+      <w:bookmarkEnd w:id="6"/>
+    </w:p>
+    <w:p>
+      <w:pPr>
+        <w:ind w:leftChars="100" w:left="240"/>
+      </w:pPr>
+      <w:r>
+        <w:rPr>
+          <w:rFonts w:hint="eastAsia"/>
+          <w:sz w:val="20"/>
+          <w:szCs w:val="20"/>
+        </w:rPr>
+        <w:t>-</w:t>
+      </w:r>
+      <w:r>
+        <w:rPr>
+          <w:rFonts w:hint="eastAsia"/>
+          <w:sz w:val="20"/>
+          <w:szCs w:val="20"/>
+        </w:rPr>
+        <w:t xml:space="preserve"> </w:t>
+      </w:r>
+      <w:r>
+        <w:rPr>
+          <w:rFonts w:hint="eastAsia"/>
+          <w:sz w:val="20"/>
+          <w:szCs w:val="20"/>
+        </w:rPr>
+        <w:t xml:space="preserve">기본적으로 </w:t>
+      </w:r>
+      <w:r>
+        <w:rPr>
+          <w:rFonts w:hint="eastAsia"/>
+          <w:sz w:val="20"/>
+          <w:szCs w:val="20"/>
+        </w:rPr>
+        <w:t>성공 조건</w:t>
+      </w:r>
+      <w:r>
+        <w:rPr>
+          <w:rFonts w:hint="eastAsia"/>
+          <w:sz w:val="20"/>
+          <w:szCs w:val="20"/>
+        </w:rPr>
+        <w:t>은</w:t>
+      </w:r>
+      <w:r>
+        <w:rPr>
+          <w:rFonts w:hint="eastAsia"/>
+          <w:sz w:val="20"/>
+          <w:szCs w:val="20"/>
+        </w:rPr>
+        <w:t xml:space="preserve"> </w:t>
+      </w:r>
+      <w:r>
+        <w:rPr>
+          <w:rFonts w:hint="eastAsia"/>
+          <w:b/>
+          <w:bCs/>
+          <w:sz w:val="20"/>
+          <w:szCs w:val="20"/>
+        </w:rPr>
+        <w:t xml:space="preserve">미션을 성공하고 </w:t>
+      </w:r>
+      <w:r>
+        <w:rPr>
+          <w:rFonts w:hint="eastAsia"/>
+          <w:b/>
+          <w:bCs/>
+          <w:sz w:val="20"/>
+          <w:szCs w:val="20"/>
+        </w:rPr>
+        <w:t xml:space="preserve">적을 처치하여 </w:t>
+      </w:r>
+      <w:r>
+        <w:rPr>
+          <w:rFonts w:hint="eastAsia"/>
+          <w:b/>
+          <w:bCs/>
+          <w:sz w:val="20"/>
+          <w:szCs w:val="20"/>
+        </w:rPr>
+        <w:t>다음 스테이지로 진입하는 것</w:t>
+      </w:r>
+      <w:r>
+        <w:rPr>
+          <w:rFonts w:hint="eastAsia"/>
+          <w:sz w:val="20"/>
+          <w:szCs w:val="20"/>
+        </w:rPr>
+        <w:t xml:space="preserve">이고 </w:t>
+      </w:r>
+      <w:r>
+        <w:rPr>
+          <w:rFonts w:hint="eastAsia"/>
+          <w:sz w:val="20"/>
+          <w:szCs w:val="20"/>
+        </w:rPr>
+        <w:t>최종 성공 조건으로는</w:t>
+      </w:r>
+      <w:r>
+        <w:rPr>
+          <w:rFonts w:hint="eastAsia"/>
+          <w:sz w:val="20"/>
+          <w:szCs w:val="20"/>
+        </w:rPr>
+        <w:t xml:space="preserve"> </w:t>
+      </w:r>
+      <w:r>
+        <w:rPr>
+          <w:rFonts w:hint="eastAsia"/>
+          <w:b/>
+          <w:bCs/>
+          <w:sz w:val="20"/>
+          <w:szCs w:val="20"/>
+        </w:rPr>
+        <w:t>스테이지를 클리어하면서 성장해서 친구를 구출하고 보스를 처치하는 것입니다.</w:t>
+      </w:r>
+    </w:p>
+    <w:p>
+      <w:pPr>
+        <w:pStyle w:val="2"/>
+        <w:ind w:leftChars="100" w:left="240"/>
+        <w:rPr>
           <w:i w:val="0"/>
           <w:iCs w:val="0"/>
           <w:sz w:val="24"/>
           <w:szCs w:val="24"/>
         </w:rPr>
-        <w:t>-</w:t>
-      </w:r>
+      </w:pPr>
+      <w:bookmarkStart w:id="7" w:name="_Toc237206046"/>
       <w:r>
         <w:rPr>
           <w:rFonts w:hint="eastAsia"/>
@@ -2007,153 +2565,87 @@
           <w:sz w:val="24"/>
           <w:szCs w:val="24"/>
         </w:rPr>
-        <w:t>5 성공 조건</w:t>
-      </w:r>
-      <w:bookmarkEnd w:id="6"/>
-    </w:p>
-    <w:p>
-      <w:pPr>
-        <w:ind w:leftChars="100" w:left="240"/>
-        <w:rPr>
-          <w:rFonts w:hint="eastAsia"/>
-        </w:rPr>
-      </w:pPr>
-      <w:r>
-        <w:rPr>
-          <w:rFonts w:hint="eastAsia"/>
-          <w:sz w:val="20"/>
-          <w:szCs w:val="20"/>
-        </w:rPr>
-        <w:t>-</w:t>
-      </w:r>
-      <w:r>
-        <w:rPr>
-          <w:rFonts w:hint="eastAsia"/>
-          <w:sz w:val="20"/>
-          <w:szCs w:val="20"/>
-        </w:rPr>
-        <w:t xml:space="preserve"> </w:t>
-      </w:r>
-      <w:r>
-        <w:rPr>
-          <w:rFonts w:hint="eastAsia"/>
-          <w:sz w:val="20"/>
-          <w:szCs w:val="20"/>
-        </w:rPr>
-        <w:t xml:space="preserve">기본적으로 </w:t>
-      </w:r>
-      <w:r>
-        <w:rPr>
-          <w:rFonts w:hint="eastAsia"/>
-          <w:sz w:val="20"/>
-          <w:szCs w:val="20"/>
-        </w:rPr>
-        <w:t>성공 조건</w:t>
-      </w:r>
-      <w:r>
-        <w:rPr>
-          <w:rFonts w:hint="eastAsia"/>
-          <w:sz w:val="20"/>
-          <w:szCs w:val="20"/>
-        </w:rPr>
-        <w:t>은</w:t>
-      </w:r>
-      <w:r>
-        <w:rPr>
-          <w:rFonts w:hint="eastAsia"/>
-          <w:sz w:val="20"/>
-          <w:szCs w:val="20"/>
-        </w:rPr>
-        <w:t xml:space="preserve"> </w:t>
-      </w:r>
-      <w:r>
-        <w:rPr>
-          <w:rFonts w:hint="eastAsia"/>
-          <w:b/>
-          <w:bCs/>
-          <w:sz w:val="20"/>
-          <w:szCs w:val="20"/>
-        </w:rPr>
-        <w:t xml:space="preserve">미션을 성공하고 </w:t>
-      </w:r>
-      <w:r>
-        <w:rPr>
-          <w:rFonts w:hint="eastAsia"/>
-          <w:b/>
-          <w:bCs/>
-          <w:sz w:val="20"/>
-          <w:szCs w:val="20"/>
-        </w:rPr>
-        <w:t xml:space="preserve">적을 처치하여 </w:t>
-      </w:r>
-      <w:r>
-        <w:rPr>
-          <w:rFonts w:hint="eastAsia"/>
-          <w:b/>
-          <w:bCs/>
-          <w:sz w:val="20"/>
-          <w:szCs w:val="20"/>
-        </w:rPr>
-        <w:t>다음 스테이지로 진입하는 것</w:t>
-      </w:r>
-      <w:r>
-        <w:rPr>
-          <w:rFonts w:hint="eastAsia"/>
-          <w:sz w:val="20"/>
-          <w:szCs w:val="20"/>
-        </w:rPr>
-        <w:t xml:space="preserve">이고 </w:t>
-      </w:r>
-      <w:r>
-        <w:rPr>
-          <w:rFonts w:hint="eastAsia"/>
-          <w:sz w:val="20"/>
-          <w:szCs w:val="20"/>
-        </w:rPr>
-        <w:t>최종 성공 조건으로는</w:t>
-      </w:r>
-      <w:r>
-        <w:rPr>
-          <w:rFonts w:hint="eastAsia"/>
-          <w:sz w:val="20"/>
-          <w:szCs w:val="20"/>
-        </w:rPr>
-        <w:t xml:space="preserve"> </w:t>
-      </w:r>
-      <w:r>
-        <w:rPr>
-          <w:rFonts w:hint="eastAsia"/>
-          <w:b/>
-          <w:bCs/>
-          <w:sz w:val="20"/>
-          <w:szCs w:val="20"/>
-        </w:rPr>
-        <w:t>스테이지를 클리어하면서 성장해서 친구를 구출하고 보스를 처치하는 것입니다.</w:t>
-      </w:r>
-    </w:p>
-    <w:p>
-      <w:pPr>
-        <w:pStyle w:val="2"/>
-        <w:ind w:leftChars="100" w:left="240"/>
-        <w:rPr>
+        <w:t>1</w:t>
+      </w:r>
+      <w:r>
+        <w:rPr>
+          <w:rFonts w:hint="eastAsia"/>
           <w:i w:val="0"/>
           <w:iCs w:val="0"/>
           <w:sz w:val="24"/>
           <w:szCs w:val="24"/>
         </w:rPr>
-      </w:pPr>
-      <w:bookmarkStart w:id="7" w:name="_Toc237114747"/>
-      <w:r>
-        <w:rPr>
-          <w:rFonts w:hint="eastAsia"/>
+        <w:t>-6 실패 조건</w:t>
+      </w:r>
+      <w:bookmarkEnd w:id="7"/>
+    </w:p>
+    <w:p>
+      <w:pPr>
+        <w:ind w:leftChars="100" w:left="240"/>
+      </w:pPr>
+      <w:r>
+        <w:rPr>
+          <w:rFonts w:hint="eastAsia"/>
+          <w:sz w:val="20"/>
+          <w:szCs w:val="20"/>
+        </w:rPr>
+        <w:t>-</w:t>
+      </w:r>
+      <w:r>
+        <w:rPr>
+          <w:rFonts w:hint="eastAsia"/>
+          <w:sz w:val="20"/>
+          <w:szCs w:val="20"/>
+        </w:rPr>
+        <w:t xml:space="preserve"> 플레이어 사망(Koi, Roi둘 중 하나</w:t>
+      </w:r>
+      <w:r>
+        <w:rPr>
+          <w:rFonts w:hint="eastAsia"/>
+          <w:sz w:val="20"/>
+          <w:szCs w:val="20"/>
+        </w:rPr>
+        <w:t xml:space="preserve"> </w:t>
+      </w:r>
+      <w:r>
+        <w:rPr>
+          <w:rFonts w:hint="eastAsia"/>
+          <w:sz w:val="20"/>
+          <w:szCs w:val="20"/>
+        </w:rPr>
+        <w:t>HP: 0일 경우</w:t>
+      </w:r>
+      <w:proofErr w:type="gramStart"/>
+      <w:r>
+        <w:rPr>
+          <w:rFonts w:hint="eastAsia"/>
+          <w:sz w:val="20"/>
+          <w:szCs w:val="20"/>
+        </w:rPr>
+        <w:t>) /</w:t>
+      </w:r>
+      <w:proofErr w:type="gramEnd"/>
+      <w:r>
+        <w:rPr>
+          <w:rFonts w:hint="eastAsia"/>
+          <w:sz w:val="20"/>
+          <w:szCs w:val="20"/>
+        </w:rPr>
+        <w:t xml:space="preserve"> 미션 실패(제한 시간 초과, 잠입 미션 중 발각)</w:t>
+      </w:r>
+    </w:p>
+    <w:p>
+      <w:pPr>
+        <w:pStyle w:val="2"/>
+        <w:ind w:leftChars="100" w:left="240"/>
+        <w:rPr>
           <w:i w:val="0"/>
           <w:iCs w:val="0"/>
           <w:sz w:val="24"/>
           <w:szCs w:val="24"/>
         </w:rPr>
-        <w:lastRenderedPageBreak/>
-        <w:t>1</w:t>
-      </w:r>
+      </w:pPr>
+      <w:bookmarkStart w:id="8" w:name="_Toc237206047"/>
       <w:r>
         <w:rPr>
           <w:rFonts w:hint="eastAsia"/>
@@ -2162,7 +2654,8 @@
           <w:sz w:val="24"/>
           <w:szCs w:val="24"/>
         </w:rPr>
-        <w:t>-</w:t>
+        <w:lastRenderedPageBreak/>
+        <w:t>1</w:t>
       </w:r>
       <w:r>
         <w:rPr>
@@ -2172,18 +2665,65 @@
           <w:sz w:val="24"/>
           <w:szCs w:val="24"/>
         </w:rPr>
-        <w:t>6</w:t>
-      </w:r>
-      <w:r>
-        <w:rPr>
-          <w:rFonts w:hint="eastAsia"/>
+        <w:t>-7 이 행동이 재미로 이어지는 이유</w:t>
+      </w:r>
+      <w:bookmarkEnd w:id="8"/>
+    </w:p>
+    <w:p>
+      <w:pPr>
+        <w:ind w:left="240"/>
+      </w:pPr>
+      <w:r>
+        <w:rPr>
+          <w:rFonts w:hint="eastAsia"/>
+          <w:sz w:val="20"/>
+          <w:szCs w:val="20"/>
+        </w:rPr>
+        <w:t>-</w:t>
+      </w:r>
+      <w:r>
+        <w:rPr>
+          <w:rFonts w:hint="eastAsia"/>
+          <w:sz w:val="20"/>
+          <w:szCs w:val="20"/>
+        </w:rPr>
+        <w:t xml:space="preserve"> </w:t>
+      </w:r>
+      <w:r>
+        <w:rPr>
+          <w:sz w:val="20"/>
+          <w:szCs w:val="20"/>
+        </w:rPr>
+        <w:t xml:space="preserve">적에게 발각되지 않으려는 잠입의 긴장감과 다양한 능력 선택을 통한 성장의 재미를 느낄 수 있으며, 매력적인 여성형 로봇 Roi를 구출한 뒤 </w:t>
+      </w:r>
+      <w:r>
+        <w:rPr>
+          <w:rFonts w:hint="eastAsia"/>
+          <w:sz w:val="20"/>
+          <w:szCs w:val="20"/>
+        </w:rPr>
+        <w:t>카메라 타겟(캐릭터)를 전환하면서</w:t>
+      </w:r>
+      <w:r>
+        <w:rPr>
+          <w:sz w:val="20"/>
+          <w:szCs w:val="20"/>
+        </w:rPr>
+        <w:t xml:space="preserve"> 함께 보스를 공략하는 성취감과 만족감을 느낄 수 있습니다.</w:t>
+      </w:r>
+    </w:p>
+    <w:p>
+      <w:pPr>
+        <w:pStyle w:val="2"/>
+        <w:ind w:leftChars="100" w:left="240"/>
+        <w:rPr>
           <w:i w:val="0"/>
           <w:iCs w:val="0"/>
           <w:sz w:val="24"/>
           <w:szCs w:val="24"/>
         </w:rPr>
-        <w:t xml:space="preserve"> </w:t>
-      </w:r>
+      </w:pPr>
+      <w:bookmarkStart w:id="9" w:name="_Toc237206048"/>
       <w:r>
         <w:rPr>
           <w:rFonts w:hint="eastAsia"/>
@@ -2192,54 +2732,9 @@
           <w:sz w:val="24"/>
           <w:szCs w:val="24"/>
         </w:rPr>
-        <w:t>실패 조건</w:t>
-      </w:r>
-      <w:bookmarkEnd w:id="7"/>
-    </w:p>
-    <w:p>
-      <w:pPr>
-        <w:ind w:leftChars="100" w:left="240"/>
-        <w:rPr>
-          <w:rFonts w:hint="eastAsia"/>
-        </w:rPr>
-      </w:pPr>
-      <w:r>
-        <w:rPr>
-          <w:rFonts w:hint="eastAsia"/>
-          <w:sz w:val="20"/>
-          <w:szCs w:val="20"/>
-        </w:rPr>
-        <w:t>-</w:t>
-      </w:r>
-      <w:r>
-        <w:rPr>
-          <w:rFonts w:hint="eastAsia"/>
-          <w:sz w:val="20"/>
-          <w:szCs w:val="20"/>
-        </w:rPr>
-        <w:t xml:space="preserve"> 플레이어 사망(Koi, Roi둘 중 하나</w:t>
-      </w:r>
-      <w:r>
-        <w:rPr>
-          <w:rFonts w:hint="eastAsia"/>
-          <w:sz w:val="20"/>
-          <w:szCs w:val="20"/>
-        </w:rPr>
-        <w:t xml:space="preserve"> </w:t>
-      </w:r>
-      <w:r>
-        <w:rPr>
-          <w:rFonts w:hint="eastAsia"/>
-          <w:sz w:val="20"/>
-          <w:szCs w:val="20"/>
-        </w:rPr>
-        <w:t>HP: 0일 경우) / 미션 실패(제한 시간 초과, 잠입 미션 중 발각)</w:t>
-      </w:r>
-    </w:p>
-    <w:p>
-      <w:pPr>
-        <w:pStyle w:val="2"/>
-        <w:ind w:leftChars="100" w:left="240"/>
+        <w:t>1</w:t>
+      </w:r>
+      <w:r>
         <w:rPr>
           <w:rFonts w:hint="eastAsia"/>
           <w:i w:val="0"/>
@@ -2247,9 +2742,211 @@
           <w:sz w:val="24"/>
           <w:szCs w:val="24"/>
         </w:rPr>
-      </w:pPr>
-      <w:bookmarkStart w:id="8" w:name="_Toc237114748"/>
-      <w:r>
+        <w:t>-8 없어도 되는 기능</w:t>
+      </w:r>
+      <w:bookmarkEnd w:id="9"/>
+    </w:p>
+    <w:p>
+      <w:pPr>
+        <w:ind w:firstLine="240"/>
+        <w:rPr>
+          <w:sz w:val="20"/>
+          <w:szCs w:val="20"/>
+        </w:rPr>
+      </w:pPr>
+      <w:r>
+        <w:rPr>
+          <w:rFonts w:hint="eastAsia"/>
+          <w:sz w:val="20"/>
+          <w:szCs w:val="20"/>
+        </w:rPr>
+        <w:t>-</w:t>
+      </w:r>
+      <w:r>
+        <w:rPr>
+          <w:rFonts w:hint="eastAsia"/>
+          <w:sz w:val="20"/>
+          <w:szCs w:val="20"/>
+        </w:rPr>
+        <w:t xml:space="preserve"> </w:t>
+      </w:r>
+      <w:r>
+        <w:rPr>
+          <w:rFonts w:hint="eastAsia"/>
+          <w:sz w:val="20"/>
+          <w:szCs w:val="20"/>
+        </w:rPr>
+        <w:t xml:space="preserve">멀티 </w:t>
+      </w:r>
+      <w:proofErr w:type="gramStart"/>
+      <w:r>
+        <w:rPr>
+          <w:rFonts w:hint="eastAsia"/>
+          <w:sz w:val="20"/>
+          <w:szCs w:val="20"/>
+        </w:rPr>
+        <w:t>플레이 /</w:t>
+      </w:r>
+      <w:proofErr w:type="gramEnd"/>
+      <w:r>
+        <w:rPr>
+          <w:rFonts w:hint="eastAsia"/>
+          <w:sz w:val="20"/>
+          <w:szCs w:val="20"/>
+        </w:rPr>
+        <w:t xml:space="preserve"> </w:t>
+      </w:r>
+      <w:r>
+        <w:rPr>
+          <w:rFonts w:hint="eastAsia"/>
+          <w:sz w:val="20"/>
+          <w:szCs w:val="20"/>
+        </w:rPr>
+        <w:t xml:space="preserve">랭킹 </w:t>
+      </w:r>
+      <w:proofErr w:type="gramStart"/>
+      <w:r>
+        <w:rPr>
+          <w:rFonts w:hint="eastAsia"/>
+          <w:sz w:val="20"/>
+          <w:szCs w:val="20"/>
+        </w:rPr>
+        <w:t>시스템</w:t>
+      </w:r>
+      <w:r>
+        <w:rPr>
+          <w:rFonts w:hint="eastAsia"/>
+          <w:sz w:val="20"/>
+          <w:szCs w:val="20"/>
+        </w:rPr>
+        <w:t xml:space="preserve"> </w:t>
+      </w:r>
+      <w:r>
+        <w:rPr>
+          <w:rFonts w:hint="eastAsia"/>
+          <w:sz w:val="20"/>
+          <w:szCs w:val="20"/>
+        </w:rPr>
+        <w:t>/</w:t>
+      </w:r>
+      <w:proofErr w:type="gramEnd"/>
+      <w:r>
+        <w:rPr>
+          <w:rFonts w:hint="eastAsia"/>
+          <w:sz w:val="20"/>
+          <w:szCs w:val="20"/>
+        </w:rPr>
+        <w:t xml:space="preserve"> 복잡한 인벤토리 </w:t>
+      </w:r>
+      <w:proofErr w:type="gramStart"/>
+      <w:r>
+        <w:rPr>
+          <w:rFonts w:hint="eastAsia"/>
+          <w:sz w:val="20"/>
+          <w:szCs w:val="20"/>
+        </w:rPr>
+        <w:t>관리 /</w:t>
+      </w:r>
+      <w:proofErr w:type="gramEnd"/>
+      <w:r>
+        <w:rPr>
+          <w:rFonts w:hint="eastAsia"/>
+          <w:sz w:val="20"/>
+          <w:szCs w:val="20"/>
+        </w:rPr>
+        <w:t xml:space="preserve"> </w:t>
+      </w:r>
+      <w:proofErr w:type="spellStart"/>
+      <w:proofErr w:type="gramStart"/>
+      <w:r>
+        <w:rPr>
+          <w:rFonts w:hint="eastAsia"/>
+          <w:sz w:val="20"/>
+          <w:szCs w:val="20"/>
+        </w:rPr>
+        <w:t>스킬트리</w:t>
+      </w:r>
+      <w:proofErr w:type="spellEnd"/>
+      <w:r>
+        <w:rPr>
+          <w:rFonts w:hint="eastAsia"/>
+          <w:sz w:val="20"/>
+          <w:szCs w:val="20"/>
+        </w:rPr>
+        <w:t xml:space="preserve"> /</w:t>
+      </w:r>
+      <w:proofErr w:type="gramEnd"/>
+      <w:r>
+        <w:rPr>
+          <w:rFonts w:hint="eastAsia"/>
+          <w:sz w:val="20"/>
+          <w:szCs w:val="20"/>
+        </w:rPr>
+        <w:t xml:space="preserve"> 상점</w:t>
+      </w:r>
+    </w:p>
+    <w:p>
+      <w:pPr>
+        <w:ind w:firstLine="240"/>
+        <w:rPr>
+          <w:rFonts w:hint="eastAsia"/>
+          <w:sz w:val="20"/>
+          <w:szCs w:val="20"/>
+        </w:rPr>
+      </w:pPr>
+    </w:p>
+    <w:p>
+      <w:pPr>
+        <w:outlineLvl w:val="0"/>
+        <w:rPr>
+          <w:rFonts w:hint="eastAsia"/>
+          <w:b/>
+          <w:bCs/>
+          <w:color w:val="4472C4" w:themeColor="accent1"/>
+          <w:sz w:val="28"/>
+          <w:szCs w:val="28"/>
+        </w:rPr>
+      </w:pPr>
+      <w:bookmarkStart w:id="10" w:name="_Toc237206049"/>
+      <w:r>
+        <w:rPr>
+          <w:rFonts w:hint="eastAsia"/>
+          <w:b/>
+          <w:bCs/>
+          <w:color w:val="4472C4" w:themeColor="accent1"/>
+          <w:sz w:val="28"/>
+          <w:szCs w:val="28"/>
+        </w:rPr>
+        <w:t>2</w:t>
+      </w:r>
+      <w:r>
+        <w:rPr>
+          <w:rFonts w:hint="eastAsia"/>
+          <w:b/>
+          <w:bCs/>
+          <w:color w:val="4472C4" w:themeColor="accent1"/>
+          <w:sz w:val="28"/>
+          <w:szCs w:val="28"/>
+        </w:rPr>
+        <w:t xml:space="preserve">. </w:t>
+      </w:r>
+      <w:r>
+        <w:rPr>
+          <w:rFonts w:hint="eastAsia"/>
+          <w:b/>
+          <w:bCs/>
+          <w:color w:val="4472C4" w:themeColor="accent1"/>
+          <w:sz w:val="28"/>
+          <w:szCs w:val="28"/>
+        </w:rPr>
+        <w:t>기본 흐름과 조건 분기</w:t>
+      </w:r>
+      <w:bookmarkEnd w:id="10"/>
+    </w:p>
+    <w:p>
+      <w:pPr>
+        <w:pStyle w:val="2"/>
+        <w:ind w:leftChars="100" w:left="240"/>
         <w:rPr>
           <w:rFonts w:hint="eastAsia"/>
           <w:i w:val="0"/>
@@ -2257,8 +2954,8 @@
           <w:sz w:val="24"/>
           <w:szCs w:val="24"/>
         </w:rPr>
-        <w:t>1</w:t>
-      </w:r>
+      </w:pPr>
+      <w:bookmarkStart w:id="11" w:name="_Toc237206050"/>
       <w:r>
         <w:rPr>
           <w:rFonts w:hint="eastAsia"/>
@@ -2267,7 +2964,7 @@
           <w:sz w:val="24"/>
           <w:szCs w:val="24"/>
         </w:rPr>
-        <w:t>-</w:t>
+        <w:t>2-</w:t>
       </w:r>
       <w:r>
         <w:rPr>
@@ -2277,60 +2974,9 @@
           <w:sz w:val="24"/>
           <w:szCs w:val="24"/>
         </w:rPr>
-        <w:t>7 이 행동이 재미로 이어지는 이유</w:t>
-      </w:r>
-      <w:bookmarkEnd w:id="8"/>
-    </w:p>
-    <w:p>
-      <w:pPr>
-        <w:ind w:left="240"/>
-        <w:rPr>
-          <w:rFonts w:hint="eastAsia"/>
-        </w:rPr>
-      </w:pPr>
-      <w:r>
-        <w:rPr>
-          <w:rFonts w:hint="eastAsia"/>
-          <w:sz w:val="20"/>
-          <w:szCs w:val="20"/>
-        </w:rPr>
-        <w:t>-</w:t>
-      </w:r>
-      <w:r>
-        <w:rPr>
-          <w:rFonts w:hint="eastAsia"/>
-          <w:sz w:val="20"/>
-          <w:szCs w:val="20"/>
-        </w:rPr>
-        <w:t xml:space="preserve"> </w:t>
-      </w:r>
-      <w:r>
-        <w:rPr>
-          <w:sz w:val="20"/>
-          <w:szCs w:val="20"/>
-        </w:rPr>
-        <w:t xml:space="preserve">적에게 발각되지 않으려는 잠입의 긴장감과 다양한 능력 선택을 통한 성장의 재미를 느낄 수 있으며, 매력적인 여성형 로봇 Roi를 구출한 뒤 </w:t>
-      </w:r>
-      <w:r>
-        <w:rPr>
-          <w:rFonts w:hint="eastAsia"/>
-          <w:sz w:val="20"/>
-          <w:szCs w:val="20"/>
-        </w:rPr>
-        <w:t>카메라 타겟(캐릭터)를 전환하면서</w:t>
-      </w:r>
-      <w:r>
-        <w:rPr>
-          <w:sz w:val="20"/>
-          <w:szCs w:val="20"/>
-        </w:rPr>
-        <w:t xml:space="preserve"> 함께 보스를 공략하는 성취감과 만족감을 느낄 수 있습니다.</w:t>
-      </w:r>
-    </w:p>
-    <w:p>
-      <w:pPr>
-        <w:pStyle w:val="2"/>
-        <w:ind w:leftChars="100" w:left="240"/>
+        <w:t>1</w:t>
+      </w:r>
+      <w:r>
         <w:rPr>
           <w:rFonts w:hint="eastAsia"/>
           <w:i w:val="0"/>
@@ -2338,112 +2984,81 @@
           <w:sz w:val="24"/>
           <w:szCs w:val="24"/>
         </w:rPr>
-      </w:pPr>
-      <w:bookmarkStart w:id="9" w:name="_Toc237114749"/>
-      <w:r>
-        <w:rPr>
-          <w:rFonts w:hint="eastAsia"/>
-          <w:i w:val="0"/>
-          <w:iCs w:val="0"/>
-          <w:sz w:val="24"/>
-          <w:szCs w:val="24"/>
-        </w:rPr>
-        <w:t>1</w:t>
-      </w:r>
-      <w:r>
-        <w:rPr>
-          <w:rFonts w:hint="eastAsia"/>
-          <w:i w:val="0"/>
-          <w:iCs w:val="0"/>
-          <w:sz w:val="24"/>
-          <w:szCs w:val="24"/>
-        </w:rPr>
-        <w:t>-</w:t>
-      </w:r>
-      <w:r>
-        <w:rPr>
-          <w:rFonts w:hint="eastAsia"/>
-          <w:i w:val="0"/>
-          <w:iCs w:val="0"/>
-          <w:sz w:val="24"/>
-          <w:szCs w:val="24"/>
-        </w:rPr>
-        <w:t>8 없어도 되는 기능</w:t>
-      </w:r>
-      <w:bookmarkEnd w:id="9"/>
+        <w:t xml:space="preserve"> 핵심 시스템 흐름도</w:t>
+      </w:r>
+      <w:bookmarkEnd w:id="11"/>
     </w:p>
     <w:p>
       <w:pPr>
-        <w:rPr>
-          <w:rFonts w:hint="eastAsia"/>
-        </w:rPr>
-      </w:pPr>
-      <w:r>
-        <w:rPr>
-          <w:rFonts w:hint="eastAsia"/>
-        </w:rPr>
-        <w:t xml:space="preserve">  </w:t>
-      </w:r>
-      <w:r>
-        <w:rPr>
-          <w:rFonts w:hint="eastAsia"/>
-          <w:sz w:val="20"/>
-          <w:szCs w:val="20"/>
-        </w:rPr>
-        <w:t>-</w:t>
-      </w:r>
-      <w:r>
-        <w:rPr>
-          <w:rFonts w:hint="eastAsia"/>
-          <w:sz w:val="20"/>
-          <w:szCs w:val="20"/>
-        </w:rPr>
-        <w:t xml:space="preserve"> </w:t>
-      </w:r>
-      <w:r>
-        <w:rPr>
-          <w:rFonts w:hint="eastAsia"/>
-          <w:sz w:val="20"/>
-          <w:szCs w:val="20"/>
-        </w:rPr>
-        <w:t>멀티 플레이</w:t>
-      </w:r>
-      <w:r>
-        <w:rPr>
-          <w:rFonts w:hint="eastAsia"/>
-          <w:sz w:val="20"/>
-          <w:szCs w:val="20"/>
-        </w:rPr>
-        <w:t xml:space="preserve"> / </w:t>
-      </w:r>
-      <w:r>
-        <w:rPr>
-          <w:rFonts w:hint="eastAsia"/>
-          <w:sz w:val="20"/>
-          <w:szCs w:val="20"/>
-        </w:rPr>
-        <w:t>랭킹 시스템</w:t>
-      </w:r>
-      <w:r>
-        <w:rPr>
-          <w:rFonts w:hint="eastAsia"/>
-          <w:sz w:val="20"/>
-          <w:szCs w:val="20"/>
-        </w:rPr>
-        <w:t xml:space="preserve"> </w:t>
-      </w:r>
-      <w:r>
-        <w:rPr>
-          <w:rFonts w:hint="eastAsia"/>
-          <w:sz w:val="20"/>
-          <w:szCs w:val="20"/>
-        </w:rPr>
-        <w:t>/ 복잡한 인벤토리 관리 / 스킬트리 / 상점</w:t>
+        <w:pStyle w:val="a6"/>
+        <w:numPr>
+          <w:ilvl w:val="0"/>
+          <w:numId w:val="7"/>
+        </w:numPr>
+        <w:rPr>
+          <w:sz w:val="20"/>
+          <w:szCs w:val="20"/>
+        </w:rPr>
+      </w:pPr>
+      <w:r>
+        <w:rPr>
+          <w:sz w:val="20"/>
+          <w:szCs w:val="20"/>
+        </w:rPr>
+        <w:t>전투·성장 시스템 흐름도</w:t>
+      </w:r>
+    </w:p>
+    <w:p>
+      <w:pPr>
+        <w:ind w:firstLine="240"/>
+        <w:rPr>
+          <w:rFonts w:hint="eastAsia"/>
+        </w:rPr>
+      </w:pPr>
+      <w:r>
+        <w:rPr>
+          <w:noProof/>
+        </w:rPr>
+        <w:drawing>
+          <wp:inline distT="0" distB="0" distL="0" distR="0" wp14:anchorId="4A21193A" wp14:editId="2624C533">
+            <wp:extent cx="5875722" cy="5829300"/>
+            <wp:effectExtent l="0" t="0" r="0" b="0"/>
+            <wp:docPr id="1313865436" name="그림 1"/>
+            <wp:cNvGraphicFramePr>
+              <a:graphicFrameLocks xmlns:a="http://schemas.openxmlformats.org/drawingml/2006/main" noChangeAspect="1"/>
+            </wp:cNvGraphicFramePr>
+            <a:graphic xmlns:a="http://schemas.openxmlformats.org/drawingml/2006/main">
+              <a:graphicData uri="http://schemas.openxmlformats.org/drawingml/2006/picture">
+                <pic:pic xmlns:pic="http://schemas.openxmlformats.org/drawingml/2006/picture">
+                  <pic:nvPicPr>
+                    <pic:cNvPr id="1313865436" name=""/>
+                    <pic:cNvPicPr/>
+                  </pic:nvPicPr>
+                  <pic:blipFill>
+                    <a:blip r:embed="rId6"/>
+                    <a:stretch>
+                      <a:fillRect/>
+                    </a:stretch>
+                  </pic:blipFill>
+                  <pic:spPr>
+                    <a:xfrm>
+                      <a:off x="0" y="0"/>
+                      <a:ext cx="5879630" cy="5833177"/>
+                    </a:xfrm>
+                    <a:prstGeom prst="rect">
+                      <a:avLst/>
+                    </a:prstGeom>
+                  </pic:spPr>
+                </pic:pic>
+              </a:graphicData>
+            </a:graphic>
+          </wp:inline>
+        </w:drawing>
       </w:r>
     </w:p>
     <w:sectPr>
       <w:pgSz w:w="11906" w:h="16838"/>
-      <w:pgMar w:top="1701" w:right="1440" w:bottom="1440" w:left="1440" w:header="851" w:footer="992" w:gutter="0"/>
+      <w:pgMar w:top="1440" w:right="1080" w:bottom="1440" w:left="1080" w:header="851" w:footer="992" w:gutter="0"/>
       <w:pgNumType w:start="0"/>
       <w:cols w:space="425"/>
       <w:titlePg/>
@@ -2860,6 +3475,119 @@
     </w:lvl>
   </w:abstractNum>
   <w:abstractNum w:abstractNumId="4" w15:restartNumberingAfterBreak="0">
+    <w:nsid w:val="64C93EB2"/>
+    <w:multiLevelType w:val="hybridMultilevel"/>
+    <w:tmpl w:val="F418C3A4"/>
+    <w:lvl w:ilvl="0" w:tplc="04090001">
+      <w:start w:val="1"/>
+      <w:numFmt w:val="bullet"/>
+      <w:lvlText w:val=""/>
+      <w:lvlJc w:val="left"/>
+      <w:pPr>
+        <w:ind w:left="1120" w:hanging="440"/>
+      </w:pPr>
+      <w:rPr>
+        <w:rFonts w:ascii="Wingdings" w:hAnsi="Wingdings" w:hint="default"/>
+      </w:rPr>
+    </w:lvl>
+    <w:lvl w:ilvl="1" w:tplc="04090003" w:tentative="1">
+      <w:start w:val="1"/>
+      <w:numFmt w:val="bullet"/>
+      <w:lvlText w:val=""/>
+      <w:lvlJc w:val="left"/>
+      <w:pPr>
+        <w:ind w:left="1560" w:hanging="440"/>
+      </w:pPr>
+      <w:rPr>
+        <w:rFonts w:ascii="Wingdings" w:hAnsi="Wingdings" w:hint="default"/>
+      </w:rPr>
+    </w:lvl>
+    <w:lvl w:ilvl="2" w:tplc="04090005" w:tentative="1">
+      <w:start w:val="1"/>
+      <w:numFmt w:val="bullet"/>
+      <w:lvlText w:val=""/>
+      <w:lvlJc w:val="left"/>
+      <w:pPr>
+        <w:ind w:left="2000" w:hanging="440"/>
+      </w:pPr>
+      <w:rPr>
+        <w:rFonts w:ascii="Wingdings" w:hAnsi="Wingdings" w:hint="default"/>
+      </w:rPr>
+    </w:lvl>
+    <w:lvl w:ilvl="3" w:tplc="04090001" w:tentative="1">
+      <w:start w:val="1"/>
+      <w:numFmt w:val="bullet"/>
+      <w:lvlText w:val=""/>
+      <w:lvlJc w:val="left"/>
+      <w:pPr>
+        <w:ind w:left="2440" w:hanging="440"/>
+      </w:pPr>
+      <w:rPr>
+        <w:rFonts w:ascii="Wingdings" w:hAnsi="Wingdings" w:hint="default"/>
+      </w:rPr>
+    </w:lvl>
+    <w:lvl w:ilvl="4" w:tplc="04090003" w:tentative="1">
+      <w:start w:val="1"/>
+      <w:numFmt w:val="bullet"/>
+      <w:lvlText w:val=""/>
+      <w:lvlJc w:val="left"/>
+      <w:pPr>
+        <w:ind w:left="2880" w:hanging="440"/>
+      </w:pPr>
+      <w:rPr>
+        <w:rFonts w:ascii="Wingdings" w:hAnsi="Wingdings" w:hint="default"/>
+      </w:rPr>
+    </w:lvl>
+    <w:lvl w:ilvl="5" w:tplc="04090005" w:tentative="1">
+      <w:start w:val="1"/>
+      <w:numFmt w:val="bullet"/>
+      <w:lvlText w:val=""/>
+      <w:lvlJc w:val="left"/>
+      <w:pPr>
+        <w:ind w:left="3320" w:hanging="440"/>
+      </w:pPr>
+      <w:rPr>
+        <w:rFonts w:ascii="Wingdings" w:hAnsi="Wingdings" w:hint="default"/>
+      </w:rPr>
+    </w:lvl>
+    <w:lvl w:ilvl="6" w:tplc="04090001" w:tentative="1">
+      <w:start w:val="1"/>
+      <w:numFmt w:val="bullet"/>
+      <w:lvlText w:val=""/>
+      <w:lvlJc w:val="left"/>
+      <w:pPr>
+        <w:ind w:left="3760" w:hanging="440"/>
+      </w:pPr>
+      <w:rPr>
+        <w:rFonts w:ascii="Wingdings" w:hAnsi="Wingdings" w:hint="default"/>
+      </w:rPr>
+    </w:lvl>
+    <w:lvl w:ilvl="7" w:tplc="04090003" w:tentative="1">
+      <w:start w:val="1"/>
+      <w:numFmt w:val="bullet"/>
+      <w:lvlText w:val=""/>
+      <w:lvlJc w:val="left"/>
+      <w:pPr>
+        <w:ind w:left="4200" w:hanging="440"/>
+      </w:pPr>
+      <w:rPr>
+        <w:rFonts w:ascii="Wingdings" w:hAnsi="Wingdings" w:hint="default"/>
+      </w:rPr>
+    </w:lvl>
+    <w:lvl w:ilvl="8" w:tplc="04090005" w:tentative="1">
+      <w:start w:val="1"/>
+      <w:numFmt w:val="bullet"/>
+      <w:lvlText w:val=""/>
+      <w:lvlJc w:val="left"/>
+      <w:pPr>
+        <w:ind w:left="4640" w:hanging="440"/>
+      </w:pPr>
+      <w:rPr>
+        <w:rFonts w:ascii="Wingdings" w:hAnsi="Wingdings" w:hint="default"/>
+      </w:rPr>
+    </w:lvl>
+  </w:abstractNum>
+  <w:abstractNum w:abstractNumId="5" w15:restartNumberingAfterBreak="0">
     <w:nsid w:val="768E0954"/>
     <w:multiLevelType w:val="hybridMultilevel"/>
     <w:tmpl w:val="885E08D6"/>
@@ -2949,7 +3677,7 @@
       </w:pPr>
     </w:lvl>
   </w:abstractNum>
-  <w:abstractNum w:abstractNumId="5" w15:restartNumberingAfterBreak="0">
+  <w:abstractNum w:abstractNumId="6" w15:restartNumberingAfterBreak="0">
     <w:nsid w:val="7FAE1780"/>
     <w:multiLevelType w:val="hybridMultilevel"/>
     <w:tmpl w:val="FFDE8808"/>
@@ -3063,7 +3791,7 @@
     </w:lvl>
   </w:abstractNum>
   <w:num w:numId="1" w16cid:durableId="197161548">
-    <w:abstractNumId w:val="4"/>
+    <w:abstractNumId w:val="5"/>
   </w:num>
   <w:num w:numId="2" w16cid:durableId="280379681">
     <w:abstractNumId w:val="0"/>
@@ -3075,10 +3803,13 @@
     <w:abstractNumId w:val="1"/>
   </w:num>
   <w:num w:numId="5" w16cid:durableId="1689329029">
-    <w:abstractNumId w:val="5"/>
+    <w:abstractNumId w:val="6"/>
   </w:num>
   <w:num w:numId="6" w16cid:durableId="451941243">
     <w:abstractNumId w:val="2"/>
+  </w:num>
+  <w:num w:numId="7" w16cid:durableId="1959867864">
+    <w:abstractNumId w:val="4"/>
   </w:num>
 </w:numbering>
 </file>
@@ -3477,7 +4208,7 @@
   <w:style w:type="paragraph" w:default="1" w:styleId="a">
     <w:name w:val="Normal"/>
     <w:qFormat/>
-    <w:rsid w:val="000A3FCE"/>
+    <w:rsid w:val="00190261"/>
     <w:rPr>
       <w:sz w:val="24"/>
       <w:szCs w:val="24"/>
@@ -4382,8 +5113,11 @@
   <w:rsids>
     <w:rsidRoot w:val="004B67D5"/>
     <w:rsid w:val="004B67D5"/>
+    <w:rsid w:val="00591F84"/>
+    <w:rsid w:val="006003BF"/>
     <w:rsid w:val="008175B9"/>
     <w:rsid w:val="00896C14"/>
+    <w:rsid w:val="00AB5408"/>
   </w:rsids>
   <m:mathPr>
     <m:mathFont m:val="Cambria Math"/>
@@ -4840,76 +5574,6 @@
     <w:semiHidden/>
     <w:unhideWhenUsed/>
   </w:style>
-  <w:style w:type="paragraph" w:customStyle="1" w:styleId="8CC2799724A74D1BA6E67FC930DDDFB5">
-    <w:name w:val="8CC2799724A74D1BA6E67FC930DDDFB5"/>
-    <w:rsid w:val="004B67D5"/>
-    <w:pPr>
-      <w:widowControl w:val="0"/>
-      <w:wordWrap w:val="0"/>
-      <w:autoSpaceDE w:val="0"/>
-      <w:autoSpaceDN w:val="0"/>
-    </w:pPr>
-  </w:style>
-  <w:style w:type="paragraph" w:customStyle="1" w:styleId="F086B146F34342D89416718827440418">
-    <w:name w:val="F086B146F34342D89416718827440418"/>
-    <w:rsid w:val="004B67D5"/>
-    <w:pPr>
-      <w:widowControl w:val="0"/>
-      <w:wordWrap w:val="0"/>
-      <w:autoSpaceDE w:val="0"/>
-      <w:autoSpaceDN w:val="0"/>
-    </w:pPr>
-  </w:style>
-  <w:style w:type="paragraph" w:customStyle="1" w:styleId="DA3325FE2593456CADA97FBE098E6D29">
-    <w:name w:val="DA3325FE2593456CADA97FBE098E6D29"/>
-    <w:rsid w:val="004B67D5"/>
-    <w:pPr>
-      <w:widowControl w:val="0"/>
-      <w:wordWrap w:val="0"/>
-      <w:autoSpaceDE w:val="0"/>
-      <w:autoSpaceDN w:val="0"/>
-    </w:pPr>
-  </w:style>
-  <w:style w:type="paragraph" w:customStyle="1" w:styleId="FA0FFE557F5D4FF9A93D27590968F53B">
-    <w:name w:val="FA0FFE557F5D4FF9A93D27590968F53B"/>
-    <w:rsid w:val="004B67D5"/>
-    <w:pPr>
-      <w:widowControl w:val="0"/>
-      <w:wordWrap w:val="0"/>
-      <w:autoSpaceDE w:val="0"/>
-      <w:autoSpaceDN w:val="0"/>
-    </w:pPr>
-  </w:style>
-  <w:style w:type="paragraph" w:customStyle="1" w:styleId="E1EA3136B5724372BB0A8C5B3C98C0D3">
-    <w:name w:val="E1EA3136B5724372BB0A8C5B3C98C0D3"/>
-    <w:rsid w:val="004B67D5"/>
-    <w:pPr>
-      <w:widowControl w:val="0"/>
-      <w:wordWrap w:val="0"/>
-      <w:autoSpaceDE w:val="0"/>
-      <w:autoSpaceDN w:val="0"/>
-    </w:pPr>
-  </w:style>
-  <w:style w:type="paragraph" w:customStyle="1" w:styleId="1FC9D840C363432798189565F69C794C">
-    <w:name w:val="1FC9D840C363432798189565F69C794C"/>
-    <w:rsid w:val="004B67D5"/>
-    <w:pPr>
-      <w:widowControl w:val="0"/>
-      <w:wordWrap w:val="0"/>
-      <w:autoSpaceDE w:val="0"/>
-      <w:autoSpaceDN w:val="0"/>
-    </w:pPr>
-  </w:style>
-  <w:style w:type="paragraph" w:customStyle="1" w:styleId="7BDA82EECF65487B9B894D658E32984B">
-    <w:name w:val="7BDA82EECF65487B9B894D658E32984B"/>
-    <w:rsid w:val="004B67D5"/>
-    <w:pPr>
-      <w:widowControl w:val="0"/>
-      <w:wordWrap w:val="0"/>
-      <w:autoSpaceDE w:val="0"/>
-      <w:autoSpaceDN w:val="0"/>
-    </w:pPr>
-  </w:style>
   <w:style w:type="paragraph" w:customStyle="1" w:styleId="100EE9185371489EA04AA4ACF6CC28E6">
     <w:name w:val="100EE9185371489EA04AA4ACF6CC28E6"/>
     <w:rsid w:val="004B67D5"/>
@@ -4952,96 +5616,6 @@
   </w:style>
   <w:style w:type="paragraph" w:customStyle="1" w:styleId="F7A8629A3AE44337B200BBE105840BC2">
     <w:name w:val="F7A8629A3AE44337B200BBE105840BC2"/>
-    <w:rsid w:val="004B67D5"/>
-    <w:pPr>
-      <w:widowControl w:val="0"/>
-      <w:wordWrap w:val="0"/>
-      <w:autoSpaceDE w:val="0"/>
-      <w:autoSpaceDN w:val="0"/>
-    </w:pPr>
-  </w:style>
-  <w:style w:type="paragraph" w:customStyle="1" w:styleId="E5432606AD2C41E28467188403D7F39E">
-    <w:name w:val="E5432606AD2C41E28467188403D7F39E"/>
-    <w:rsid w:val="004B67D5"/>
-    <w:pPr>
-      <w:widowControl w:val="0"/>
-      <w:wordWrap w:val="0"/>
-      <w:autoSpaceDE w:val="0"/>
-      <w:autoSpaceDN w:val="0"/>
-    </w:pPr>
-  </w:style>
-  <w:style w:type="paragraph" w:customStyle="1" w:styleId="61527A9634E542B6A7BEF0EC3CDC89EB">
-    <w:name w:val="61527A9634E542B6A7BEF0EC3CDC89EB"/>
-    <w:rsid w:val="004B67D5"/>
-    <w:pPr>
-      <w:widowControl w:val="0"/>
-      <w:wordWrap w:val="0"/>
-      <w:autoSpaceDE w:val="0"/>
-      <w:autoSpaceDN w:val="0"/>
-    </w:pPr>
-  </w:style>
-  <w:style w:type="paragraph" w:customStyle="1" w:styleId="125F82C91BC44E0BB25E3BF3E4FC8BF7">
-    <w:name w:val="125F82C91BC44E0BB25E3BF3E4FC8BF7"/>
-    <w:rsid w:val="004B67D5"/>
-    <w:pPr>
-      <w:widowControl w:val="0"/>
-      <w:wordWrap w:val="0"/>
-      <w:autoSpaceDE w:val="0"/>
-      <w:autoSpaceDN w:val="0"/>
-    </w:pPr>
-  </w:style>
-  <w:style w:type="paragraph" w:customStyle="1" w:styleId="F9E9EFBE879F4A58A6C8373E7973F7F0">
-    <w:name w:val="F9E9EFBE879F4A58A6C8373E7973F7F0"/>
-    <w:rsid w:val="004B67D5"/>
-    <w:pPr>
-      <w:widowControl w:val="0"/>
-      <w:wordWrap w:val="0"/>
-      <w:autoSpaceDE w:val="0"/>
-      <w:autoSpaceDN w:val="0"/>
-    </w:pPr>
-  </w:style>
-  <w:style w:type="paragraph" w:customStyle="1" w:styleId="DC39F53F5C924F9B8374DCE8E0E5EC07">
-    <w:name w:val="DC39F53F5C924F9B8374DCE8E0E5EC07"/>
-    <w:rsid w:val="004B67D5"/>
-    <w:pPr>
-      <w:widowControl w:val="0"/>
-      <w:wordWrap w:val="0"/>
-      <w:autoSpaceDE w:val="0"/>
-      <w:autoSpaceDN w:val="0"/>
-    </w:pPr>
-  </w:style>
-  <w:style w:type="paragraph" w:customStyle="1" w:styleId="15558E34ED914DEA804F650A0BD5407F">
-    <w:name w:val="15558E34ED914DEA804F650A0BD5407F"/>
-    <w:rsid w:val="004B67D5"/>
-    <w:pPr>
-      <w:widowControl w:val="0"/>
-      <w:wordWrap w:val="0"/>
-      <w:autoSpaceDE w:val="0"/>
-      <w:autoSpaceDN w:val="0"/>
-    </w:pPr>
-  </w:style>
-  <w:style w:type="paragraph" w:customStyle="1" w:styleId="DCA74D4CAED6435A8CB567A1A837F43B">
-    <w:name w:val="DCA74D4CAED6435A8CB567A1A837F43B"/>
-    <w:rsid w:val="004B67D5"/>
-    <w:pPr>
-      <w:widowControl w:val="0"/>
-      <w:wordWrap w:val="0"/>
-      <w:autoSpaceDE w:val="0"/>
-      <w:autoSpaceDN w:val="0"/>
-    </w:pPr>
-  </w:style>
-  <w:style w:type="paragraph" w:customStyle="1" w:styleId="4BA260B072CB4B20A8052213FF574534">
-    <w:name w:val="4BA260B072CB4B20A8052213FF574534"/>
-    <w:rsid w:val="004B67D5"/>
-    <w:pPr>
-      <w:widowControl w:val="0"/>
-      <w:wordWrap w:val="0"/>
-      <w:autoSpaceDE w:val="0"/>
-      <w:autoSpaceDN w:val="0"/>
-    </w:pPr>
-  </w:style>
-  <w:style w:type="paragraph" w:customStyle="1" w:styleId="9AF022900D4841419D5ECEF4D9472117">
-    <w:name w:val="9AF022900D4841419D5ECEF4D9472117"/>
     <w:rsid w:val="004B67D5"/>
     <w:pPr>
       <w:widowControl w:val="0"/>

</xml_diff>